<commit_message>
Refactor API key handling in contact forms
- Removed the VITE_API_KEY_TARGET environment variable and related logic for determining the API key target (local/prod).
- Simplified the retrieval of the transaction email API key to use a single VITE_API_KEY environment variable.
- Updated the vite-env.d.ts file to reflect the changes in environment variables.
</commit_message>
<xml_diff>
--- a/sites/document/public/templates/lot-closure-report.docx
+++ b/sites/document/public/templates/lot-closure-report.docx
@@ -1,6 +1,6 @@
 
 <file path=word/document.xml><?xml version="1.0" encoding="utf-8"?>
-<w:document xmlns:wpc="http://schemas.microsoft.com/office/word/2010/wordprocessingCanvas" xmlns:cx="http://schemas.microsoft.com/office/drawing/2014/chartex" xmlns:cx1="http://schemas.microsoft.com/office/drawing/2015/9/8/chartex" xmlns:cx2="http://schemas.microsoft.com/office/drawing/2015/10/21/chartex" xmlns:cx3="http://schemas.microsoft.com/office/drawing/2016/5/9/chartex" xmlns:cx4="http://schemas.microsoft.com/office/drawing/2016/5/10/chartex" xmlns:cx5="http://schemas.microsoft.com/office/drawing/2016/5/11/chartex" xmlns:cx6="http://schemas.microsoft.com/office/drawing/2016/5/12/chartex" xmlns:cx7="http://schemas.microsoft.com/office/drawing/2016/5/13/chartex" xmlns:cx8="http://schemas.microsoft.com/office/drawing/2016/5/14/chartex" xmlns:mc="http://schemas.openxmlformats.org/markup-compatibility/2006" xmlns:aink="http://schemas.microsoft.com/office/drawing/2016/ink" xmlns:am3d="http://schemas.microsoft.com/office/drawing/2017/model3d" xmlns:o="urn:schemas-microsoft-com:office:office" xmlns:oel="http://schemas.microsoft.com/office/2019/extlst" xmlns:r="http://schemas.openxmlformats.org/officeDocument/2006/relationships" xmlns:m="http://schemas.openxmlformats.org/officeDocument/2006/math" xmlns:v="urn:schemas-microsoft-com:vml" xmlns:wp14="http://schemas.microsoft.com/office/word/2010/wordprocessingDrawing" xmlns:wp="http://schemas.openxmlformats.org/drawingml/2006/wordprocessingDrawing" xmlns:w10="urn:schemas-microsoft-com:office:word" xmlns:w="http://schemas.openxmlformats.org/wordprocessingml/2006/main" xmlns:w14="http://schemas.microsoft.com/office/word/2010/wordml" xmlns:w15="http://schemas.microsoft.com/office/word/2012/wordml" xmlns:w16cex="http://schemas.microsoft.com/office/word/2018/wordml/cex" xmlns:w16cid="http://schemas.microsoft.com/office/word/2016/wordml/cid" xmlns:w16="http://schemas.microsoft.com/office/word/2018/wordml" xmlns:w16du="http://schemas.microsoft.com/office/word/2023/wordml/word16du" xmlns:w16sdtdh="http://schemas.microsoft.com/office/word/2020/wordml/sdtdatahash" xmlns:w16sdtfl="http://schemas.microsoft.com/office/word/2024/wordml/sdtformatlock" xmlns:w16se="http://schemas.microsoft.com/office/word/2015/wordml/symex" xmlns:wpg="http://schemas.microsoft.com/office/word/2010/wordprocessingGroup" xmlns:wpi="http://schemas.microsoft.com/office/word/2010/wordprocessingInk" xmlns:wne="http://schemas.microsoft.com/office/word/2006/wordml" xmlns:wps="http://schemas.microsoft.com/office/word/2010/wordprocessingShape" mc:Ignorable="w14 w15 w16se w16cid w16 w16cex w16sdtdh w16sdtfl w16du wp14">
+<w:document xmlns:wpc="http://schemas.microsoft.com/office/word/2010/wordprocessingCanvas" xmlns:cx="http://schemas.microsoft.com/office/drawing/2014/chartex" xmlns:cx1="http://schemas.microsoft.com/office/drawing/2015/9/8/chartex" xmlns:cx2="http://schemas.microsoft.com/office/drawing/2015/10/21/chartex" xmlns:cx3="http://schemas.microsoft.com/office/drawing/2016/5/9/chartex" xmlns:cx4="http://schemas.microsoft.com/office/drawing/2016/5/10/chartex" xmlns:cx5="http://schemas.microsoft.com/office/drawing/2016/5/11/chartex" xmlns:cx6="http://schemas.microsoft.com/office/drawing/2016/5/12/chartex" xmlns:cx7="http://schemas.microsoft.com/office/drawing/2016/5/13/chartex" xmlns:cx8="http://schemas.microsoft.com/office/drawing/2016/5/14/chartex" xmlns:mc="http://schemas.openxmlformats.org/markup-compatibility/2006" xmlns:aink="http://schemas.microsoft.com/office/drawing/2016/ink" xmlns:am3d="http://schemas.microsoft.com/office/drawing/2017/model3d" xmlns:o="urn:schemas-microsoft-com:office:office" xmlns:oel="http://schemas.microsoft.com/office/2019/extlst" xmlns:r="http://schemas.openxmlformats.org/officeDocument/2006/relationships" xmlns:m="http://schemas.openxmlformats.org/officeDocument/2006/math" xmlns:v="urn:schemas-microsoft-com:vml" xmlns:wp14="http://schemas.microsoft.com/office/word/2010/wordprocessingDrawing" xmlns:wp="http://schemas.openxmlformats.org/drawingml/2006/wordprocessingDrawing" xmlns:w10="urn:schemas-microsoft-com:office:word" xmlns:w="http://schemas.openxmlformats.org/wordprocessingml/2006/main" xmlns:w14="http://schemas.microsoft.com/office/word/2010/wordml" xmlns:w15="http://schemas.microsoft.com/office/word/2012/wordml" xmlns:w16cei="http://schemas.microsoft.com/office/word/2026/wordml/cei" xmlns:w16cex="http://schemas.microsoft.com/office/word/2018/wordml/cex" xmlns:w16cid="http://schemas.microsoft.com/office/word/2016/wordml/cid" xmlns:w16="http://schemas.microsoft.com/office/word/2018/wordml" xmlns:w16du="http://schemas.microsoft.com/office/word/2023/wordml/word16du" xmlns:w16sdtdh="http://schemas.microsoft.com/office/word/2020/wordml/sdtdatahash" xmlns:w16sdtfl="http://schemas.microsoft.com/office/word/2024/wordml/sdtformatlock" xmlns:w16se="http://schemas.microsoft.com/office/word/2015/wordml/symex" xmlns:wpg="http://schemas.microsoft.com/office/word/2010/wordprocessingGroup" xmlns:wpi="http://schemas.microsoft.com/office/word/2010/wordprocessingInk" xmlns:wne="http://schemas.microsoft.com/office/word/2006/wordml" xmlns:wps="http://schemas.microsoft.com/office/word/2010/wordprocessingShape" mc:Ignorable="w14 w15 w16se w16cid w16 w16cex w16sdtdh w16sdtfl w16du wp14">
   <w:body>
     <w:p>
       <w:pPr>
@@ -76,559 +76,463 @@
       </w:r>
     </w:p>
     <w:p/>
+    <w:p>
+      <w:pPr>
+        <w:spacing w:line="240" w:lineRule="auto"/>
+        <w:jc w:val="center"/>
+        <w:rPr>
+          <w:b/>
+          <w:bCs/>
+          <w:color w:val="1C3D5A"/>
+        </w:rPr>
+      </w:pPr>
+      <w:r>
+        <w:rPr>
+          <w:b/>
+          <w:bCs/>
+          <w:color w:val="1C3D5A"/>
+        </w:rPr>
+        <w:t>PROJECT INFORMATION</w:t>
+      </w:r>
+    </w:p>
+    <w:p>
+      <w:pPr>
+        <w:spacing w:after="0" w:line="240" w:lineRule="auto"/>
+        <w:jc w:val="center"/>
+        <w:rPr>
+          <w:b/>
+          <w:bCs/>
+        </w:rPr>
+      </w:pPr>
+      <w:r>
+        <w:t xml:space="preserve">Project </w:t>
+      </w:r>
+      <w:proofErr w:type="gramStart"/>
+      <w:r>
+        <w:t xml:space="preserve">Number: </w:t>
+      </w:r>
+      <w:r>
+        <w:rPr>
+          <w:b/>
+          <w:bCs/>
+        </w:rPr>
+        <w:t>{</w:t>
+      </w:r>
+      <w:proofErr w:type="spellStart"/>
+      <w:proofErr w:type="gramEnd"/>
+      <w:r>
+        <w:rPr>
+          <w:b/>
+          <w:bCs/>
+        </w:rPr>
+        <w:t>projectNumber</w:t>
+      </w:r>
+      <w:proofErr w:type="spellEnd"/>
+      <w:r>
+        <w:rPr>
+          <w:b/>
+          <w:bCs/>
+        </w:rPr>
+        <w:t>}</w:t>
+      </w:r>
+    </w:p>
+    <w:p>
+      <w:pPr>
+        <w:spacing w:after="0" w:line="240" w:lineRule="auto"/>
+        <w:jc w:val="center"/>
+        <w:rPr>
+          <w:b/>
+        </w:rPr>
+      </w:pPr>
+      <w:r>
+        <w:rPr>
+          <w:bCs/>
+        </w:rPr>
+        <w:t xml:space="preserve">Application #: </w:t>
+      </w:r>
+      <w:r>
+        <w:rPr>
+          <w:b/>
+        </w:rPr>
+        <w:t>{</w:t>
+      </w:r>
+      <w:proofErr w:type="spellStart"/>
+      <w:r>
+        <w:rPr>
+          <w:b/>
+        </w:rPr>
+        <w:t>applicationNumber</w:t>
+      </w:r>
+      <w:proofErr w:type="spellEnd"/>
+      <w:r>
+        <w:rPr>
+          <w:b/>
+        </w:rPr>
+        <w:t>}</w:t>
+      </w:r>
+    </w:p>
+    <w:p>
+      <w:pPr>
+        <w:spacing w:after="0" w:line="240" w:lineRule="auto"/>
+        <w:jc w:val="center"/>
+        <w:rPr>
+          <w:b/>
+        </w:rPr>
+      </w:pPr>
+      <w:proofErr w:type="gramStart"/>
+      <w:r>
+        <w:rPr>
+          <w:bCs/>
+        </w:rPr>
+        <w:t xml:space="preserve">Submittal #: </w:t>
+      </w:r>
+      <w:r>
+        <w:rPr>
+          <w:b/>
+        </w:rPr>
+        <w:t>{</w:t>
+      </w:r>
+      <w:proofErr w:type="spellStart"/>
+      <w:proofErr w:type="gramEnd"/>
+      <w:r>
+        <w:rPr>
+          <w:b/>
+        </w:rPr>
+        <w:t>submittalNumber</w:t>
+      </w:r>
+      <w:proofErr w:type="spellEnd"/>
+      <w:r>
+        <w:rPr>
+          <w:b/>
+        </w:rPr>
+        <w:t>}</w:t>
+      </w:r>
+    </w:p>
+    <w:p>
+      <w:pPr>
+        <w:spacing w:after="0" w:line="240" w:lineRule="auto"/>
+        <w:jc w:val="center"/>
+        <w:rPr>
+          <w:b/>
+        </w:rPr>
+      </w:pPr>
+      <w:r>
+        <w:rPr>
+          <w:bCs/>
+        </w:rPr>
+        <w:t xml:space="preserve">Report Date: </w:t>
+      </w:r>
+      <w:r>
+        <w:rPr>
+          <w:b/>
+        </w:rPr>
+        <w:t>{</w:t>
+      </w:r>
+      <w:proofErr w:type="spellStart"/>
+      <w:r>
+        <w:rPr>
+          <w:b/>
+        </w:rPr>
+        <w:t>submittalDate</w:t>
+      </w:r>
+      <w:proofErr w:type="spellEnd"/>
+      <w:r>
+        <w:rPr>
+          <w:b/>
+        </w:rPr>
+        <w:t>}</w:t>
+      </w:r>
+    </w:p>
+    <w:p>
+      <w:pPr>
+        <w:jc w:val="center"/>
+      </w:pPr>
+      <w:r>
+        <w:rPr>
+          <w:bCs/>
+        </w:rPr>
+        <w:t xml:space="preserve">Report Pages: </w:t>
+      </w:r>
+      <w:r>
+        <w:rPr>
+          <w:b/>
+        </w:rPr>
+        <w:fldChar w:fldCharType="begin"/>
+      </w:r>
+      <w:r>
+        <w:rPr>
+          <w:b/>
+        </w:rPr>
+        <w:instrText xml:space="preserve"> NUMPAGES  \# "0 'Pages'" \* Arabic  \* MERGEFORMAT </w:instrText>
+      </w:r>
+      <w:r>
+        <w:rPr>
+          <w:b/>
+        </w:rPr>
+        <w:fldChar w:fldCharType="separate"/>
+      </w:r>
+      <w:r>
+        <w:rPr>
+          <w:b/>
+          <w:noProof/>
+        </w:rPr>
+        <w:t>1</w:t>
+      </w:r>
+      <w:r>
+        <w:rPr>
+          <w:b/>
+        </w:rPr>
+        <w:fldChar w:fldCharType="end"/>
+      </w:r>
+      <w:r>
+        <w:rPr>
+          <w:b/>
+        </w:rPr>
+        <w:t xml:space="preserve"> Pages</w:t>
+      </w:r>
+    </w:p>
     <w:p/>
-    <w:tbl>
-      <w:tblPr>
-        <w:tblStyle w:val="TableGrid"/>
-        <w:tblW w:w="0" w:type="auto"/>
-        <w:tblBorders>
-          <w:top w:val="none" w:sz="0" w:space="0" w:color="auto"/>
-          <w:left w:val="none" w:sz="0" w:space="0" w:color="auto"/>
-          <w:bottom w:val="none" w:sz="0" w:space="0" w:color="auto"/>
-          <w:right w:val="none" w:sz="0" w:space="0" w:color="auto"/>
-          <w:insideH w:val="none" w:sz="0" w:space="0" w:color="auto"/>
-          <w:insideV w:val="none" w:sz="0" w:space="0" w:color="auto"/>
-        </w:tblBorders>
-        <w:tblLook w:val="04A0" w:firstRow="1" w:lastRow="0" w:firstColumn="1" w:lastColumn="0" w:noHBand="0" w:noVBand="1"/>
-      </w:tblPr>
-      <w:tblGrid>
-        <w:gridCol w:w="3510"/>
-        <w:gridCol w:w="3600"/>
-        <w:gridCol w:w="3680"/>
-      </w:tblGrid>
-      <w:tr>
-        <w:tc>
-          <w:tcPr>
-            <w:tcW w:w="3510" w:type="dxa"/>
-          </w:tcPr>
-          <w:p>
-            <w:pPr>
-              <w:spacing w:line="240" w:lineRule="auto"/>
-              <w:jc w:val="center"/>
-              <w:rPr>
-                <w:b/>
-                <w:bCs/>
-                <w:color w:val="1C3D5A"/>
-              </w:rPr>
-            </w:pPr>
-            <w:r>
-              <w:rPr>
-                <w:b/>
-                <w:bCs/>
-                <w:color w:val="1C3D5A"/>
-              </w:rPr>
-              <w:t>PROJECT INFORMATION</w:t>
-            </w:r>
-          </w:p>
-          <w:p>
-            <w:pPr>
-              <w:spacing w:after="0" w:line="240" w:lineRule="auto"/>
-              <w:jc w:val="center"/>
-              <w:rPr>
-                <w:b/>
-                <w:bCs/>
-              </w:rPr>
-            </w:pPr>
-            <w:r>
-              <w:t xml:space="preserve">Project </w:t>
-            </w:r>
-            <w:proofErr w:type="gramStart"/>
-            <w:r>
-              <w:t xml:space="preserve">Number: </w:t>
-            </w:r>
-            <w:r>
-              <w:rPr>
-                <w:b/>
-                <w:bCs/>
-              </w:rPr>
-              <w:t>{</w:t>
-            </w:r>
-            <w:proofErr w:type="gramEnd"/>
-            <w:r>
-              <w:rPr>
-                <w:b/>
-                <w:bCs/>
-              </w:rPr>
-              <w:t>projectNumber</w:t>
-            </w:r>
-            <w:r>
-              <w:rPr>
-                <w:b/>
-                <w:bCs/>
-              </w:rPr>
-              <w:t>}</w:t>
-            </w:r>
-          </w:p>
-          <w:p>
-            <w:pPr>
-              <w:spacing w:after="0" w:line="240" w:lineRule="auto"/>
-              <w:jc w:val="center"/>
-              <w:rPr>
-                <w:b/>
-              </w:rPr>
-            </w:pPr>
-            <w:r>
-              <w:rPr>
-                <w:bCs/>
-              </w:rPr>
-              <w:t xml:space="preserve">Application #: </w:t>
-            </w:r>
-            <w:r>
-              <w:rPr>
-                <w:b/>
-              </w:rPr>
-              <w:t>{</w:t>
-            </w:r>
-            <w:r>
-              <w:rPr>
-                <w:b/>
-              </w:rPr>
-              <w:t>a</w:t>
-            </w:r>
-            <w:r>
-              <w:rPr>
-                <w:b/>
-              </w:rPr>
-              <w:t>pplicationNumber}</w:t>
-            </w:r>
-          </w:p>
-          <w:p>
-            <w:pPr>
-              <w:spacing w:after="0" w:line="240" w:lineRule="auto"/>
-              <w:jc w:val="center"/>
-              <w:rPr>
-                <w:b/>
-              </w:rPr>
-            </w:pPr>
-            <w:proofErr w:type="gramStart"/>
-            <w:r>
-              <w:rPr>
-                <w:bCs/>
-              </w:rPr>
-              <w:t>Submittal</w:t>
-            </w:r>
-            <w:r>
-              <w:rPr>
-                <w:bCs/>
-              </w:rPr>
-              <w:t xml:space="preserve"> #: </w:t>
-            </w:r>
-            <w:r>
-              <w:rPr>
-                <w:b/>
-              </w:rPr>
-              <w:t>{</w:t>
-            </w:r>
-            <w:proofErr w:type="gramEnd"/>
-            <w:r>
-              <w:rPr>
-                <w:b/>
-              </w:rPr>
-              <w:t>s</w:t>
-            </w:r>
-            <w:r>
-              <w:rPr>
-                <w:b/>
-              </w:rPr>
-              <w:t>ubmittalNumber}</w:t>
-            </w:r>
-          </w:p>
-          <w:p>
-            <w:pPr>
-              <w:spacing w:after="0" w:line="240" w:lineRule="auto"/>
-              <w:jc w:val="center"/>
-              <w:rPr>
-                <w:b/>
-              </w:rPr>
-            </w:pPr>
-            <w:r>
-              <w:rPr>
-                <w:bCs/>
-              </w:rPr>
-              <w:t xml:space="preserve">Report Date: </w:t>
-            </w:r>
-            <w:r>
-              <w:rPr>
-                <w:b/>
-              </w:rPr>
-              <w:t>{</w:t>
-            </w:r>
-            <w:r>
-              <w:rPr>
-                <w:b/>
-              </w:rPr>
-              <w:t>s</w:t>
-            </w:r>
-            <w:r>
-              <w:rPr>
-                <w:b/>
-              </w:rPr>
-              <w:t>ubmittalDate}</w:t>
-            </w:r>
-          </w:p>
-          <w:p>
-            <w:pPr>
-              <w:spacing w:after="0" w:line="240" w:lineRule="auto"/>
-              <w:jc w:val="center"/>
-              <w:rPr>
-                <w:bCs/>
-              </w:rPr>
-            </w:pPr>
-            <w:r>
-              <w:rPr>
-                <w:bCs/>
-              </w:rPr>
-              <w:t xml:space="preserve">Report Pages: </w:t>
-            </w:r>
-            <w:r>
-              <w:rPr>
-                <w:b/>
-              </w:rPr>
-              <w:fldChar w:fldCharType="begin"/>
-            </w:r>
-            <w:r>
-              <w:rPr>
-                <w:b/>
-              </w:rPr>
-              <w:instrText xml:space="preserve"> NUMPAGES  \# "0 'Pages'" \* Arabic  \* MERGEFORMAT </w:instrText>
-            </w:r>
-            <w:r>
-              <w:rPr>
-                <w:b/>
-              </w:rPr>
-              <w:fldChar w:fldCharType="separate"/>
-            </w:r>
-            <w:r>
-              <w:rPr>
-                <w:b/>
-                <w:noProof/>
-              </w:rPr>
-              <w:t>3</w:t>
-            </w:r>
-            <w:r>
-              <w:rPr>
-                <w:b/>
-              </w:rPr>
-              <w:fldChar w:fldCharType="end"/>
-            </w:r>
-            <w:r>
-              <w:rPr>
-                <w:b/>
-              </w:rPr>
-              <w:t xml:space="preserve"> Pages</w:t>
-            </w:r>
-          </w:p>
-        </w:tc>
-        <w:tc>
-          <w:tcPr>
-            <w:tcW w:w="3600" w:type="dxa"/>
-          </w:tcPr>
-          <w:p>
-            <w:pPr>
-              <w:spacing w:line="240" w:lineRule="auto"/>
-              <w:jc w:val="center"/>
-              <w:rPr>
-                <w:b/>
-                <w:bCs/>
-                <w:color w:val="1C3D5A"/>
-              </w:rPr>
-            </w:pPr>
-            <w:r>
-              <w:rPr>
-                <w:b/>
-                <w:bCs/>
-                <w:color w:val="1C3D5A"/>
-              </w:rPr>
-              <w:t>OWNER INFORMATION</w:t>
-            </w:r>
-          </w:p>
-          <w:p>
-            <w:pPr>
-              <w:spacing w:after="0" w:line="240" w:lineRule="auto"/>
-              <w:jc w:val="center"/>
-              <w:rPr>
-                <w:b/>
-                <w:bCs/>
-                <w:color w:val="1C3D5A"/>
-              </w:rPr>
-            </w:pPr>
-            <w:r>
-              <w:rPr>
-                <w:b/>
-                <w:bCs/>
-                <w:color w:val="1C3D5A"/>
-              </w:rPr>
-              <w:t>{</w:t>
-            </w:r>
-            <w:r>
-              <w:rPr>
-                <w:b/>
-                <w:bCs/>
-                <w:color w:val="1C3D5A"/>
-              </w:rPr>
-              <w:t>c</w:t>
-            </w:r>
-            <w:r>
-              <w:rPr>
-                <w:b/>
-                <w:bCs/>
-                <w:color w:val="1C3D5A"/>
-              </w:rPr>
-              <w:t>lientName}</w:t>
-            </w:r>
-          </w:p>
-          <w:p>
-            <w:pPr>
-              <w:spacing w:after="0" w:line="240" w:lineRule="auto"/>
-              <w:jc w:val="center"/>
-              <w:rPr>
-                <w:color w:val="1C3D5A"/>
-              </w:rPr>
-            </w:pPr>
-            <w:r>
-              <w:rPr>
-                <w:color w:val="1C3D5A"/>
-              </w:rPr>
-              <w:t>{</w:t>
-            </w:r>
-            <w:r>
-              <w:rPr>
-                <w:color w:val="1C3D5A"/>
-              </w:rPr>
-              <w:t>c</w:t>
-            </w:r>
-            <w:r>
-              <w:rPr>
-                <w:color w:val="1C3D5A"/>
-              </w:rPr>
-              <w:t>lientAddress}</w:t>
-            </w:r>
-          </w:p>
-          <w:p>
-            <w:pPr>
-              <w:spacing w:after="0" w:line="240" w:lineRule="auto"/>
-              <w:jc w:val="center"/>
-              <w:rPr>
-                <w:color w:val="1C3D5A"/>
-              </w:rPr>
-            </w:pPr>
-            <w:proofErr w:type="gramStart"/>
-            <w:r>
-              <w:rPr>
-                <w:color w:val="1C3D5A"/>
-              </w:rPr>
-              <w:t>{</w:t>
-            </w:r>
-            <w:r>
-              <w:rPr>
-                <w:color w:val="1C3D5A"/>
-              </w:rPr>
-              <w:t>c</w:t>
-            </w:r>
-            <w:r>
-              <w:rPr>
-                <w:color w:val="1C3D5A"/>
-              </w:rPr>
-              <w:t>lientCity</w:t>
-            </w:r>
-            <w:r>
-              <w:rPr>
-                <w:color w:val="1C3D5A"/>
-              </w:rPr>
-              <w:t>}, {</w:t>
-            </w:r>
-            <w:proofErr w:type="gramEnd"/>
-            <w:r>
-              <w:rPr>
-                <w:color w:val="1C3D5A"/>
-              </w:rPr>
-              <w:t>client</w:t>
-            </w:r>
-            <w:r>
-              <w:rPr>
-                <w:color w:val="1C3D5A"/>
-              </w:rPr>
-              <w:t>State</w:t>
-            </w:r>
-            <w:r>
-              <w:rPr>
-                <w:color w:val="1C3D5A"/>
-              </w:rPr>
-              <w:t>} {client</w:t>
-            </w:r>
-            <w:r>
-              <w:rPr>
-                <w:color w:val="1C3D5A"/>
-              </w:rPr>
-              <w:t>Zip}</w:t>
-            </w:r>
-          </w:p>
-        </w:tc>
-        <w:tc>
-          <w:tcPr>
-            <w:tcW w:w="3680" w:type="dxa"/>
-          </w:tcPr>
-          <w:p>
-            <w:pPr>
-              <w:spacing w:line="240" w:lineRule="auto"/>
-              <w:jc w:val="center"/>
-              <w:rPr>
-                <w:b/>
-                <w:bCs/>
-                <w:color w:val="1C3D5A"/>
-              </w:rPr>
-            </w:pPr>
-            <w:r>
-              <w:rPr>
-                <w:b/>
-                <w:bCs/>
-                <w:color w:val="1C3D5A"/>
-              </w:rPr>
-              <w:t>PREPARER INFORMATION</w:t>
-            </w:r>
-          </w:p>
-          <w:p>
-            <w:pPr>
-              <w:spacing w:after="0" w:line="240" w:lineRule="auto"/>
-              <w:jc w:val="center"/>
-              <w:rPr>
-                <w:b/>
-                <w:bCs/>
-                <w:color w:val="1C3D5A"/>
-              </w:rPr>
-            </w:pPr>
-            <w:r>
-              <w:rPr>
-                <w:b/>
-                <w:bCs/>
-                <w:color w:val="1C3D5A"/>
-              </w:rPr>
-              <w:t>White Point Surveying &amp; Mapping</w:t>
-            </w:r>
-          </w:p>
-          <w:p>
-            <w:pPr>
-              <w:spacing w:after="0" w:line="240" w:lineRule="auto"/>
-              <w:jc w:val="center"/>
-              <w:rPr>
-                <w:color w:val="1C3D5A"/>
-              </w:rPr>
-            </w:pPr>
-            <w:r>
-              <w:rPr>
-                <w:color w:val="1C3D5A"/>
-              </w:rPr>
-              <w:t>642 Crimson Ct</w:t>
-            </w:r>
-          </w:p>
-          <w:p>
-            <w:pPr>
-              <w:spacing w:after="0" w:line="240" w:lineRule="auto"/>
-              <w:jc w:val="center"/>
-              <w:rPr>
-                <w:color w:val="1C3D5A"/>
-              </w:rPr>
-            </w:pPr>
-            <w:r>
-              <w:rPr>
-                <w:color w:val="1C3D5A"/>
-              </w:rPr>
-              <w:t>Altamonte Springs, FL 32701</w:t>
-            </w:r>
-          </w:p>
-          <w:p>
-            <w:pPr>
-              <w:spacing w:after="0" w:line="240" w:lineRule="auto"/>
-              <w:jc w:val="center"/>
-              <w:rPr>
-                <w:color w:val="1C3D5A"/>
-              </w:rPr>
-            </w:pPr>
-            <w:r>
-              <w:rPr>
-                <w:color w:val="1C3D5A"/>
-              </w:rPr>
-              <w:t>Licensed Business #8700</w:t>
-            </w:r>
-          </w:p>
-          <w:p>
-            <w:pPr>
-              <w:spacing w:after="0" w:line="240" w:lineRule="auto"/>
-              <w:jc w:val="center"/>
-              <w:rPr>
-                <w:color w:val="1C3D5A"/>
-              </w:rPr>
-            </w:pPr>
-            <w:proofErr w:type="gramStart"/>
-            <w:r>
-              <w:rPr>
-                <w:color w:val="1C3D5A"/>
-              </w:rPr>
-              <w:t xml:space="preserve">Surveyor: </w:t>
-            </w:r>
-            <w:r>
-              <w:rPr>
-                <w:b/>
-                <w:bCs/>
-                <w:color w:val="1C3D5A"/>
-              </w:rPr>
-              <w:t>{</w:t>
-            </w:r>
-            <w:proofErr w:type="gramEnd"/>
-            <w:r>
-              <w:rPr>
-                <w:b/>
-                <w:bCs/>
-                <w:color w:val="1C3D5A"/>
-              </w:rPr>
-              <w:t>surveyorName}</w:t>
-            </w:r>
-          </w:p>
-          <w:p>
-            <w:pPr>
-              <w:spacing w:after="0" w:line="240" w:lineRule="auto"/>
-              <w:jc w:val="center"/>
-              <w:rPr>
-                <w:b/>
-                <w:bCs/>
-                <w:color w:val="1C3D5A"/>
-              </w:rPr>
-            </w:pPr>
-            <w:r>
-              <w:rPr>
-                <w:color w:val="1C3D5A"/>
-              </w:rPr>
-              <w:t xml:space="preserve">Preparer: </w:t>
-            </w:r>
-            <w:r>
-              <w:rPr>
-                <w:b/>
-                <w:bCs/>
-                <w:color w:val="1C3D5A"/>
-              </w:rPr>
-              <w:t>{preparerName}</w:t>
-            </w:r>
-          </w:p>
-        </w:tc>
-      </w:tr>
-    </w:tbl>
+    <w:p>
+      <w:pPr>
+        <w:spacing w:line="240" w:lineRule="auto"/>
+        <w:jc w:val="center"/>
+        <w:rPr>
+          <w:b/>
+          <w:bCs/>
+          <w:color w:val="1C3D5A"/>
+        </w:rPr>
+      </w:pPr>
+      <w:r>
+        <w:rPr>
+          <w:b/>
+          <w:bCs/>
+          <w:color w:val="1C3D5A"/>
+        </w:rPr>
+        <w:t>OWNER INFORMATION</w:t>
+      </w:r>
+    </w:p>
+    <w:p>
+      <w:pPr>
+        <w:spacing w:after="0" w:line="240" w:lineRule="auto"/>
+        <w:jc w:val="center"/>
+        <w:rPr>
+          <w:b/>
+          <w:bCs/>
+        </w:rPr>
+      </w:pPr>
+      <w:r>
+        <w:rPr>
+          <w:b/>
+          <w:bCs/>
+        </w:rPr>
+        <w:t>{</w:t>
+      </w:r>
+      <w:proofErr w:type="spellStart"/>
+      <w:r>
+        <w:rPr>
+          <w:b/>
+          <w:bCs/>
+        </w:rPr>
+        <w:t>clientName</w:t>
+      </w:r>
+      <w:proofErr w:type="spellEnd"/>
+      <w:r>
+        <w:rPr>
+          <w:b/>
+          <w:bCs/>
+        </w:rPr>
+        <w:t>}</w:t>
+      </w:r>
+    </w:p>
+    <w:p>
+      <w:pPr>
+        <w:spacing w:after="0" w:line="240" w:lineRule="auto"/>
+        <w:jc w:val="center"/>
+      </w:pPr>
+      <w:r>
+        <w:t>{</w:t>
+      </w:r>
+      <w:proofErr w:type="spellStart"/>
+      <w:r>
+        <w:t>clientAddress</w:t>
+      </w:r>
+      <w:proofErr w:type="spellEnd"/>
+      <w:r>
+        <w:t>}</w:t>
+      </w:r>
+    </w:p>
+    <w:p>
+      <w:pPr>
+        <w:jc w:val="center"/>
+      </w:pPr>
+      <w:proofErr w:type="gramStart"/>
+      <w:r>
+        <w:t>{</w:t>
+      </w:r>
+      <w:proofErr w:type="spellStart"/>
+      <w:r>
+        <w:t>clientCity</w:t>
+      </w:r>
+      <w:proofErr w:type="spellEnd"/>
+      <w:r>
+        <w:t>}, {</w:t>
+      </w:r>
+      <w:proofErr w:type="spellStart"/>
+      <w:proofErr w:type="gramEnd"/>
+      <w:r>
+        <w:t>clientState</w:t>
+      </w:r>
+      <w:proofErr w:type="spellEnd"/>
+      <w:r>
+        <w:t>} {</w:t>
+      </w:r>
+      <w:proofErr w:type="spellStart"/>
+      <w:r>
+        <w:t>clientZip</w:t>
+      </w:r>
+      <w:proofErr w:type="spellEnd"/>
+      <w:r>
+        <w:t>}</w:t>
+      </w:r>
+    </w:p>
     <w:p/>
-    <w:p/>
-    <w:p/>
-    <w:p/>
-    <w:p/>
-    <w:p/>
-    <w:p/>
-    <w:p/>
+    <w:p>
+      <w:pPr>
+        <w:spacing w:line="240" w:lineRule="auto"/>
+        <w:jc w:val="center"/>
+        <w:rPr>
+          <w:b/>
+          <w:bCs/>
+          <w:color w:val="1C3D5A"/>
+        </w:rPr>
+      </w:pPr>
+      <w:r>
+        <w:rPr>
+          <w:b/>
+          <w:bCs/>
+          <w:color w:val="1C3D5A"/>
+        </w:rPr>
+        <w:t>PREPARER INFORMATION</w:t>
+      </w:r>
+    </w:p>
+    <w:p>
+      <w:pPr>
+        <w:spacing w:after="0" w:line="240" w:lineRule="auto"/>
+        <w:jc w:val="center"/>
+        <w:rPr>
+          <w:b/>
+          <w:bCs/>
+        </w:rPr>
+      </w:pPr>
+      <w:r>
+        <w:rPr>
+          <w:b/>
+          <w:bCs/>
+        </w:rPr>
+        <w:t>White Point Surveying &amp; Mapping</w:t>
+      </w:r>
+    </w:p>
+    <w:p>
+      <w:pPr>
+        <w:spacing w:after="0" w:line="240" w:lineRule="auto"/>
+        <w:jc w:val="center"/>
+      </w:pPr>
+      <w:r>
+        <w:t>642 Crimson Ct</w:t>
+      </w:r>
+    </w:p>
+    <w:p>
+      <w:pPr>
+        <w:spacing w:after="0" w:line="240" w:lineRule="auto"/>
+        <w:jc w:val="center"/>
+      </w:pPr>
+      <w:r>
+        <w:t>Altamonte Springs, FL 32701</w:t>
+      </w:r>
+    </w:p>
+    <w:p>
+      <w:pPr>
+        <w:spacing w:after="0" w:line="240" w:lineRule="auto"/>
+        <w:jc w:val="center"/>
+      </w:pPr>
+      <w:r>
+        <w:t>Licensed Business #8700</w:t>
+      </w:r>
+    </w:p>
+    <w:p>
+      <w:pPr>
+        <w:spacing w:after="0" w:line="240" w:lineRule="auto"/>
+        <w:jc w:val="center"/>
+      </w:pPr>
+      <w:proofErr w:type="gramStart"/>
+      <w:r>
+        <w:t xml:space="preserve">Surveyor: </w:t>
+      </w:r>
+      <w:r>
+        <w:rPr>
+          <w:b/>
+          <w:bCs/>
+        </w:rPr>
+        <w:t>{</w:t>
+      </w:r>
+      <w:proofErr w:type="spellStart"/>
+      <w:proofErr w:type="gramEnd"/>
+      <w:r>
+        <w:rPr>
+          <w:b/>
+          <w:bCs/>
+        </w:rPr>
+        <w:t>surveyorName</w:t>
+      </w:r>
+      <w:proofErr w:type="spellEnd"/>
+      <w:r>
+        <w:rPr>
+          <w:b/>
+          <w:bCs/>
+        </w:rPr>
+        <w:t>}</w:t>
+      </w:r>
+    </w:p>
     <w:p>
       <w:pPr>
         <w:tabs>
           <w:tab w:val="left" w:pos="5950"/>
         </w:tabs>
-      </w:pPr>
-      <w:r>
-        <w:tab/>
-      </w:r>
+        <w:jc w:val="center"/>
+      </w:pPr>
+      <w:r>
+        <w:t xml:space="preserve">Preparer: </w:t>
+      </w:r>
+      <w:r>
+        <w:rPr>
+          <w:b/>
+          <w:bCs/>
+        </w:rPr>
+        <w:t>{</w:t>
+      </w:r>
+      <w:proofErr w:type="spellStart"/>
+      <w:r>
+        <w:rPr>
+          <w:b/>
+          <w:bCs/>
+        </w:rPr>
+        <w:t>preparerName</w:t>
+      </w:r>
+      <w:proofErr w:type="spellEnd"/>
+      <w:r>
+        <w:rPr>
+          <w:b/>
+          <w:bCs/>
+        </w:rPr>
+        <w:t>}</w:t>
+      </w:r>
+    </w:p>
+    <w:p>
+      <w:pPr>
+        <w:tabs>
+          <w:tab w:val="left" w:pos="5950"/>
+        </w:tabs>
+      </w:pPr>
     </w:p>
     <w:p>
       <w:pPr>
@@ -648,9 +552,6 @@
           <w:docGrid w:linePitch="360"/>
         </w:sectPr>
       </w:pPr>
-      <w:r>
-        <w:tab/>
-      </w:r>
     </w:p>
     <w:p>
       <w:pPr>
@@ -726,10 +627,12 @@
         </w:r>
         <w:r>
           <w:rPr>
+            <w:b/>
+            <w:bCs/>
             <w:noProof/>
             <w:webHidden/>
           </w:rPr>
-          <w:t>3</w:t>
+          <w:t>Error! Bookmark not defined.</w:t>
         </w:r>
         <w:r>
           <w:rPr>
@@ -762,16 +665,34 @@
       </w:pPr>
       <w:r>
         <w:lastRenderedPageBreak/>
-        <w:t>{</w:t>
-      </w:r>
-      <w:r>
-        <w:t>report</w:t>
-      </w:r>
-      <w:r>
-        <w:t>}</w:t>
-      </w:r>
-      <w:r>
-        <w:t xml:space="preserve"> </w:t>
+        <w:t>{#closures}</w:t>
+      </w:r>
+    </w:p>
+    <w:p>
+      <w:pPr>
+        <w:pStyle w:val="ClosureReportHeader"/>
+      </w:pPr>
+      <w:r>
+        <w:t>{name}</w:t>
+      </w:r>
+    </w:p>
+    <w:p>
+      <w:pPr>
+        <w:pStyle w:val="ClosureReportText"/>
+        <w:pBdr>
+          <w:bottom w:val="single" w:sz="4" w:space="1" w:color="auto"/>
+        </w:pBdr>
+      </w:pPr>
+      <w:r>
+        <w:t>{body}</w:t>
+      </w:r>
+    </w:p>
+    <w:p>
+      <w:pPr>
+        <w:pStyle w:val="ClosureReportText"/>
+      </w:pPr>
+      <w:r>
+        <w:t>{/closures}</w:t>
       </w:r>
     </w:p>
     <w:sectPr>
@@ -786,7 +707,7 @@
 </file>
 
 <file path=word/endnotes.xml><?xml version="1.0" encoding="utf-8"?>
-<w:endnotes xmlns:wpc="http://schemas.microsoft.com/office/word/2010/wordprocessingCanvas" xmlns:cx="http://schemas.microsoft.com/office/drawing/2014/chartex" xmlns:cx1="http://schemas.microsoft.com/office/drawing/2015/9/8/chartex" xmlns:cx2="http://schemas.microsoft.com/office/drawing/2015/10/21/chartex" xmlns:cx3="http://schemas.microsoft.com/office/drawing/2016/5/9/chartex" xmlns:cx4="http://schemas.microsoft.com/office/drawing/2016/5/10/chartex" xmlns:cx5="http://schemas.microsoft.com/office/drawing/2016/5/11/chartex" xmlns:cx6="http://schemas.microsoft.com/office/drawing/2016/5/12/chartex" xmlns:cx7="http://schemas.microsoft.com/office/drawing/2016/5/13/chartex" xmlns:cx8="http://schemas.microsoft.com/office/drawing/2016/5/14/chartex" xmlns:mc="http://schemas.openxmlformats.org/markup-compatibility/2006" xmlns:aink="http://schemas.microsoft.com/office/drawing/2016/ink" xmlns:am3d="http://schemas.microsoft.com/office/drawing/2017/model3d" xmlns:o="urn:schemas-microsoft-com:office:office" xmlns:oel="http://schemas.microsoft.com/office/2019/extlst" xmlns:r="http://schemas.openxmlformats.org/officeDocument/2006/relationships" xmlns:m="http://schemas.openxmlformats.org/officeDocument/2006/math" xmlns:v="urn:schemas-microsoft-com:vml" xmlns:wp14="http://schemas.microsoft.com/office/word/2010/wordprocessingDrawing" xmlns:wp="http://schemas.openxmlformats.org/drawingml/2006/wordprocessingDrawing" xmlns:w10="urn:schemas-microsoft-com:office:word" xmlns:w="http://schemas.openxmlformats.org/wordprocessingml/2006/main" xmlns:w14="http://schemas.microsoft.com/office/word/2010/wordml" xmlns:w15="http://schemas.microsoft.com/office/word/2012/wordml" xmlns:w16cex="http://schemas.microsoft.com/office/word/2018/wordml/cex" xmlns:w16cid="http://schemas.microsoft.com/office/word/2016/wordml/cid" xmlns:w16="http://schemas.microsoft.com/office/word/2018/wordml" xmlns:w16du="http://schemas.microsoft.com/office/word/2023/wordml/word16du" xmlns:w16sdtdh="http://schemas.microsoft.com/office/word/2020/wordml/sdtdatahash" xmlns:w16sdtfl="http://schemas.microsoft.com/office/word/2024/wordml/sdtformatlock" xmlns:w16se="http://schemas.microsoft.com/office/word/2015/wordml/symex" xmlns:wpg="http://schemas.microsoft.com/office/word/2010/wordprocessingGroup" xmlns:wpi="http://schemas.microsoft.com/office/word/2010/wordprocessingInk" xmlns:wne="http://schemas.microsoft.com/office/word/2006/wordml" xmlns:wps="http://schemas.microsoft.com/office/word/2010/wordprocessingShape" mc:Ignorable="w14 w15 w16se w16cid w16 w16cex w16sdtdh w16sdtfl w16du wp14">
+<w:endnotes xmlns:wpc="http://schemas.microsoft.com/office/word/2010/wordprocessingCanvas" xmlns:cx="http://schemas.microsoft.com/office/drawing/2014/chartex" xmlns:cx1="http://schemas.microsoft.com/office/drawing/2015/9/8/chartex" xmlns:cx2="http://schemas.microsoft.com/office/drawing/2015/10/21/chartex" xmlns:cx3="http://schemas.microsoft.com/office/drawing/2016/5/9/chartex" xmlns:cx4="http://schemas.microsoft.com/office/drawing/2016/5/10/chartex" xmlns:cx5="http://schemas.microsoft.com/office/drawing/2016/5/11/chartex" xmlns:cx6="http://schemas.microsoft.com/office/drawing/2016/5/12/chartex" xmlns:cx7="http://schemas.microsoft.com/office/drawing/2016/5/13/chartex" xmlns:cx8="http://schemas.microsoft.com/office/drawing/2016/5/14/chartex" xmlns:mc="http://schemas.openxmlformats.org/markup-compatibility/2006" xmlns:aink="http://schemas.microsoft.com/office/drawing/2016/ink" xmlns:am3d="http://schemas.microsoft.com/office/drawing/2017/model3d" xmlns:o="urn:schemas-microsoft-com:office:office" xmlns:oel="http://schemas.microsoft.com/office/2019/extlst" xmlns:r="http://schemas.openxmlformats.org/officeDocument/2006/relationships" xmlns:m="http://schemas.openxmlformats.org/officeDocument/2006/math" xmlns:v="urn:schemas-microsoft-com:vml" xmlns:wp14="http://schemas.microsoft.com/office/word/2010/wordprocessingDrawing" xmlns:wp="http://schemas.openxmlformats.org/drawingml/2006/wordprocessingDrawing" xmlns:w10="urn:schemas-microsoft-com:office:word" xmlns:w="http://schemas.openxmlformats.org/wordprocessingml/2006/main" xmlns:w14="http://schemas.microsoft.com/office/word/2010/wordml" xmlns:w15="http://schemas.microsoft.com/office/word/2012/wordml" xmlns:w16cei="http://schemas.microsoft.com/office/word/2026/wordml/cei" xmlns:w16cex="http://schemas.microsoft.com/office/word/2018/wordml/cex" xmlns:w16cid="http://schemas.microsoft.com/office/word/2016/wordml/cid" xmlns:w16="http://schemas.microsoft.com/office/word/2018/wordml" xmlns:w16du="http://schemas.microsoft.com/office/word/2023/wordml/word16du" xmlns:w16sdtdh="http://schemas.microsoft.com/office/word/2020/wordml/sdtdatahash" xmlns:w16sdtfl="http://schemas.microsoft.com/office/word/2024/wordml/sdtformatlock" xmlns:w16se="http://schemas.microsoft.com/office/word/2015/wordml/symex" xmlns:wpg="http://schemas.microsoft.com/office/word/2010/wordprocessingGroup" xmlns:wpi="http://schemas.microsoft.com/office/word/2010/wordprocessingInk" xmlns:wne="http://schemas.microsoft.com/office/word/2006/wordml" xmlns:wps="http://schemas.microsoft.com/office/word/2010/wordprocessingShape" mc:Ignorable="w14 w15 w16se w16cid w16 w16cex w16sdtdh w16sdtfl w16du wp14">
   <w:endnote w:type="separator" w:id="-1">
     <w:p>
       <w:pPr>
@@ -811,7 +732,7 @@
 </file>
 
 <file path=word/footer1.xml><?xml version="1.0" encoding="utf-8"?>
-<w:ftr xmlns:wpc="http://schemas.microsoft.com/office/word/2010/wordprocessingCanvas" xmlns:cx="http://schemas.microsoft.com/office/drawing/2014/chartex" xmlns:cx1="http://schemas.microsoft.com/office/drawing/2015/9/8/chartex" xmlns:cx2="http://schemas.microsoft.com/office/drawing/2015/10/21/chartex" xmlns:cx3="http://schemas.microsoft.com/office/drawing/2016/5/9/chartex" xmlns:cx4="http://schemas.microsoft.com/office/drawing/2016/5/10/chartex" xmlns:cx5="http://schemas.microsoft.com/office/drawing/2016/5/11/chartex" xmlns:cx6="http://schemas.microsoft.com/office/drawing/2016/5/12/chartex" xmlns:cx7="http://schemas.microsoft.com/office/drawing/2016/5/13/chartex" xmlns:cx8="http://schemas.microsoft.com/office/drawing/2016/5/14/chartex" xmlns:mc="http://schemas.openxmlformats.org/markup-compatibility/2006" xmlns:aink="http://schemas.microsoft.com/office/drawing/2016/ink" xmlns:am3d="http://schemas.microsoft.com/office/drawing/2017/model3d" xmlns:o="urn:schemas-microsoft-com:office:office" xmlns:oel="http://schemas.microsoft.com/office/2019/extlst" xmlns:r="http://schemas.openxmlformats.org/officeDocument/2006/relationships" xmlns:m="http://schemas.openxmlformats.org/officeDocument/2006/math" xmlns:v="urn:schemas-microsoft-com:vml" xmlns:wp14="http://schemas.microsoft.com/office/word/2010/wordprocessingDrawing" xmlns:wp="http://schemas.openxmlformats.org/drawingml/2006/wordprocessingDrawing" xmlns:w10="urn:schemas-microsoft-com:office:word" xmlns:w="http://schemas.openxmlformats.org/wordprocessingml/2006/main" xmlns:w14="http://schemas.microsoft.com/office/word/2010/wordml" xmlns:w15="http://schemas.microsoft.com/office/word/2012/wordml" xmlns:w16cex="http://schemas.microsoft.com/office/word/2018/wordml/cex" xmlns:w16cid="http://schemas.microsoft.com/office/word/2016/wordml/cid" xmlns:w16="http://schemas.microsoft.com/office/word/2018/wordml" xmlns:w16du="http://schemas.microsoft.com/office/word/2023/wordml/word16du" xmlns:w16sdtdh="http://schemas.microsoft.com/office/word/2020/wordml/sdtdatahash" xmlns:w16sdtfl="http://schemas.microsoft.com/office/word/2024/wordml/sdtformatlock" xmlns:w16se="http://schemas.microsoft.com/office/word/2015/wordml/symex" xmlns:wpg="http://schemas.microsoft.com/office/word/2010/wordprocessingGroup" xmlns:wpi="http://schemas.microsoft.com/office/word/2010/wordprocessingInk" xmlns:wne="http://schemas.microsoft.com/office/word/2006/wordml" xmlns:wps="http://schemas.microsoft.com/office/word/2010/wordprocessingShape" mc:Ignorable="w14 w15 w16se w16cid w16 w16cex w16sdtdh w16sdtfl w16du wp14">
+<w:ftr xmlns:wpc="http://schemas.microsoft.com/office/word/2010/wordprocessingCanvas" xmlns:cx="http://schemas.microsoft.com/office/drawing/2014/chartex" xmlns:cx1="http://schemas.microsoft.com/office/drawing/2015/9/8/chartex" xmlns:cx2="http://schemas.microsoft.com/office/drawing/2015/10/21/chartex" xmlns:cx3="http://schemas.microsoft.com/office/drawing/2016/5/9/chartex" xmlns:cx4="http://schemas.microsoft.com/office/drawing/2016/5/10/chartex" xmlns:cx5="http://schemas.microsoft.com/office/drawing/2016/5/11/chartex" xmlns:cx6="http://schemas.microsoft.com/office/drawing/2016/5/12/chartex" xmlns:cx7="http://schemas.microsoft.com/office/drawing/2016/5/13/chartex" xmlns:cx8="http://schemas.microsoft.com/office/drawing/2016/5/14/chartex" xmlns:mc="http://schemas.openxmlformats.org/markup-compatibility/2006" xmlns:aink="http://schemas.microsoft.com/office/drawing/2016/ink" xmlns:am3d="http://schemas.microsoft.com/office/drawing/2017/model3d" xmlns:o="urn:schemas-microsoft-com:office:office" xmlns:oel="http://schemas.microsoft.com/office/2019/extlst" xmlns:r="http://schemas.openxmlformats.org/officeDocument/2006/relationships" xmlns:m="http://schemas.openxmlformats.org/officeDocument/2006/math" xmlns:v="urn:schemas-microsoft-com:vml" xmlns:wp14="http://schemas.microsoft.com/office/word/2010/wordprocessingDrawing" xmlns:wp="http://schemas.openxmlformats.org/drawingml/2006/wordprocessingDrawing" xmlns:w10="urn:schemas-microsoft-com:office:word" xmlns:w="http://schemas.openxmlformats.org/wordprocessingml/2006/main" xmlns:w14="http://schemas.microsoft.com/office/word/2010/wordml" xmlns:w15="http://schemas.microsoft.com/office/word/2012/wordml" xmlns:w16cei="http://schemas.microsoft.com/office/word/2026/wordml/cei" xmlns:w16cex="http://schemas.microsoft.com/office/word/2018/wordml/cex" xmlns:w16cid="http://schemas.microsoft.com/office/word/2016/wordml/cid" xmlns:w16="http://schemas.microsoft.com/office/word/2018/wordml" xmlns:w16du="http://schemas.microsoft.com/office/word/2023/wordml/word16du" xmlns:w16sdtdh="http://schemas.microsoft.com/office/word/2020/wordml/sdtdatahash" xmlns:w16sdtfl="http://schemas.microsoft.com/office/word/2024/wordml/sdtformatlock" xmlns:w16se="http://schemas.microsoft.com/office/word/2015/wordml/symex" xmlns:wpg="http://schemas.microsoft.com/office/word/2010/wordprocessingGroup" xmlns:wpi="http://schemas.microsoft.com/office/word/2010/wordprocessingInk" xmlns:wne="http://schemas.microsoft.com/office/word/2006/wordml" xmlns:wps="http://schemas.microsoft.com/office/word/2010/wordprocessingShape" mc:Ignorable="w14 w15 w16se w16cid w16 w16cex w16sdtdh w16sdtfl w16du wp14">
   <w:tbl>
     <w:tblPr>
       <w:tblStyle w:val="TableGrid"/>
@@ -844,17 +765,27 @@
           <w:r>
             <w:t>{</w:t>
           </w:r>
+          <w:proofErr w:type="spellStart"/>
           <w:r>
             <w:t>p</w:t>
           </w:r>
           <w:r>
-            <w:t>rojectNumber} {</w:t>
-          </w:r>
+            <w:t>rojectNumber</w:t>
+          </w:r>
+          <w:proofErr w:type="spellEnd"/>
+          <w:r>
+            <w:t>} {</w:t>
+          </w:r>
+          <w:proofErr w:type="spellStart"/>
           <w:r>
             <w:t>p</w:t>
           </w:r>
           <w:r>
-            <w:t>rojectName}</w:t>
+            <w:t>rojectName</w:t>
+          </w:r>
+          <w:proofErr w:type="spellEnd"/>
+          <w:r>
+            <w:t>}</w:t>
           </w:r>
         </w:p>
         <w:p>
@@ -865,11 +796,16 @@
           <w:r>
             <w:t>{</w:t>
           </w:r>
+          <w:proofErr w:type="spellStart"/>
           <w:r>
             <w:t>a</w:t>
           </w:r>
           <w:r>
-            <w:t xml:space="preserve">pplicationNumber} </w:t>
+            <w:t>pplicationNumber</w:t>
+          </w:r>
+          <w:proofErr w:type="spellEnd"/>
+          <w:r>
+            <w:t xml:space="preserve">} </w:t>
           </w:r>
           <w:r>
             <w:t>Submittal</w:t>
@@ -877,17 +813,27 @@
           <w:r>
             <w:t xml:space="preserve"> {</w:t>
           </w:r>
+          <w:proofErr w:type="spellStart"/>
           <w:r>
             <w:t>s</w:t>
           </w:r>
           <w:r>
-            <w:t>ubmittalNumber} ({</w:t>
-          </w:r>
+            <w:t>ubmittalNumber</w:t>
+          </w:r>
+          <w:proofErr w:type="spellEnd"/>
+          <w:r>
+            <w:t>} ({</w:t>
+          </w:r>
+          <w:proofErr w:type="spellStart"/>
           <w:r>
             <w:t>s</w:t>
           </w:r>
           <w:r>
-            <w:t>ubmittalDate})</w:t>
+            <w:t>ubmittalDate</w:t>
+          </w:r>
+          <w:proofErr w:type="spellEnd"/>
+          <w:r>
+            <w:t>})</w:t>
           </w:r>
         </w:p>
       </w:tc>
@@ -903,11 +849,16 @@
           <w:r>
             <w:t>{</w:t>
           </w:r>
+          <w:proofErr w:type="spellStart"/>
           <w:r>
             <w:t>c</w:t>
           </w:r>
           <w:r>
-            <w:t>lientName}</w:t>
+            <w:t>lientName</w:t>
+          </w:r>
+          <w:proofErr w:type="spellEnd"/>
+          <w:r>
+            <w:t>}</w:t>
           </w:r>
         </w:p>
         <w:p>
@@ -1006,7 +957,7 @@
 </file>
 
 <file path=word/footer2.xml><?xml version="1.0" encoding="utf-8"?>
-<w:ftr xmlns:wpc="http://schemas.microsoft.com/office/word/2010/wordprocessingCanvas" xmlns:cx="http://schemas.microsoft.com/office/drawing/2014/chartex" xmlns:cx1="http://schemas.microsoft.com/office/drawing/2015/9/8/chartex" xmlns:cx2="http://schemas.microsoft.com/office/drawing/2015/10/21/chartex" xmlns:cx3="http://schemas.microsoft.com/office/drawing/2016/5/9/chartex" xmlns:cx4="http://schemas.microsoft.com/office/drawing/2016/5/10/chartex" xmlns:cx5="http://schemas.microsoft.com/office/drawing/2016/5/11/chartex" xmlns:cx6="http://schemas.microsoft.com/office/drawing/2016/5/12/chartex" xmlns:cx7="http://schemas.microsoft.com/office/drawing/2016/5/13/chartex" xmlns:cx8="http://schemas.microsoft.com/office/drawing/2016/5/14/chartex" xmlns:mc="http://schemas.openxmlformats.org/markup-compatibility/2006" xmlns:aink="http://schemas.microsoft.com/office/drawing/2016/ink" xmlns:am3d="http://schemas.microsoft.com/office/drawing/2017/model3d" xmlns:o="urn:schemas-microsoft-com:office:office" xmlns:oel="http://schemas.microsoft.com/office/2019/extlst" xmlns:r="http://schemas.openxmlformats.org/officeDocument/2006/relationships" xmlns:m="http://schemas.openxmlformats.org/officeDocument/2006/math" xmlns:v="urn:schemas-microsoft-com:vml" xmlns:wp14="http://schemas.microsoft.com/office/word/2010/wordprocessingDrawing" xmlns:wp="http://schemas.openxmlformats.org/drawingml/2006/wordprocessingDrawing" xmlns:w10="urn:schemas-microsoft-com:office:word" xmlns:w="http://schemas.openxmlformats.org/wordprocessingml/2006/main" xmlns:w14="http://schemas.microsoft.com/office/word/2010/wordml" xmlns:w15="http://schemas.microsoft.com/office/word/2012/wordml" xmlns:w16cex="http://schemas.microsoft.com/office/word/2018/wordml/cex" xmlns:w16cid="http://schemas.microsoft.com/office/word/2016/wordml/cid" xmlns:w16="http://schemas.microsoft.com/office/word/2018/wordml" xmlns:w16du="http://schemas.microsoft.com/office/word/2023/wordml/word16du" xmlns:w16sdtdh="http://schemas.microsoft.com/office/word/2020/wordml/sdtdatahash" xmlns:w16sdtfl="http://schemas.microsoft.com/office/word/2024/wordml/sdtformatlock" xmlns:w16se="http://schemas.microsoft.com/office/word/2015/wordml/symex" xmlns:wpg="http://schemas.microsoft.com/office/word/2010/wordprocessingGroup" xmlns:wpi="http://schemas.microsoft.com/office/word/2010/wordprocessingInk" xmlns:wne="http://schemas.microsoft.com/office/word/2006/wordml" xmlns:wps="http://schemas.microsoft.com/office/word/2010/wordprocessingShape" mc:Ignorable="w14 w15 w16se w16cid w16 w16cex w16sdtdh w16sdtfl w16du wp14">
+<w:ftr xmlns:wpc="http://schemas.microsoft.com/office/word/2010/wordprocessingCanvas" xmlns:cx="http://schemas.microsoft.com/office/drawing/2014/chartex" xmlns:cx1="http://schemas.microsoft.com/office/drawing/2015/9/8/chartex" xmlns:cx2="http://schemas.microsoft.com/office/drawing/2015/10/21/chartex" xmlns:cx3="http://schemas.microsoft.com/office/drawing/2016/5/9/chartex" xmlns:cx4="http://schemas.microsoft.com/office/drawing/2016/5/10/chartex" xmlns:cx5="http://schemas.microsoft.com/office/drawing/2016/5/11/chartex" xmlns:cx6="http://schemas.microsoft.com/office/drawing/2016/5/12/chartex" xmlns:cx7="http://schemas.microsoft.com/office/drawing/2016/5/13/chartex" xmlns:cx8="http://schemas.microsoft.com/office/drawing/2016/5/14/chartex" xmlns:mc="http://schemas.openxmlformats.org/markup-compatibility/2006" xmlns:aink="http://schemas.microsoft.com/office/drawing/2016/ink" xmlns:am3d="http://schemas.microsoft.com/office/drawing/2017/model3d" xmlns:o="urn:schemas-microsoft-com:office:office" xmlns:oel="http://schemas.microsoft.com/office/2019/extlst" xmlns:r="http://schemas.openxmlformats.org/officeDocument/2006/relationships" xmlns:m="http://schemas.openxmlformats.org/officeDocument/2006/math" xmlns:v="urn:schemas-microsoft-com:vml" xmlns:wp14="http://schemas.microsoft.com/office/word/2010/wordprocessingDrawing" xmlns:wp="http://schemas.openxmlformats.org/drawingml/2006/wordprocessingDrawing" xmlns:w10="urn:schemas-microsoft-com:office:word" xmlns:w="http://schemas.openxmlformats.org/wordprocessingml/2006/main" xmlns:w14="http://schemas.microsoft.com/office/word/2010/wordml" xmlns:w15="http://schemas.microsoft.com/office/word/2012/wordml" xmlns:w16cei="http://schemas.microsoft.com/office/word/2026/wordml/cei" xmlns:w16cex="http://schemas.microsoft.com/office/word/2018/wordml/cex" xmlns:w16cid="http://schemas.microsoft.com/office/word/2016/wordml/cid" xmlns:w16="http://schemas.microsoft.com/office/word/2018/wordml" xmlns:w16du="http://schemas.microsoft.com/office/word/2023/wordml/word16du" xmlns:w16sdtdh="http://schemas.microsoft.com/office/word/2020/wordml/sdtdatahash" xmlns:w16sdtfl="http://schemas.microsoft.com/office/word/2024/wordml/sdtformatlock" xmlns:w16se="http://schemas.microsoft.com/office/word/2015/wordml/symex" xmlns:wpg="http://schemas.microsoft.com/office/word/2010/wordprocessingGroup" xmlns:wpi="http://schemas.microsoft.com/office/word/2010/wordprocessingInk" xmlns:wne="http://schemas.microsoft.com/office/word/2006/wordml" xmlns:wps="http://schemas.microsoft.com/office/word/2010/wordprocessingShape" mc:Ignorable="w14 w15 w16se w16cid w16 w16cex w16sdtdh w16sdtfl w16du wp14">
   <w:tbl>
     <w:tblPr>
       <w:tblStyle w:val="TableGrid"/>
@@ -1039,17 +990,27 @@
           <w:r>
             <w:t>{</w:t>
           </w:r>
+          <w:proofErr w:type="spellStart"/>
           <w:r>
             <w:t>p</w:t>
           </w:r>
           <w:r>
-            <w:t>rojectNumber} {</w:t>
-          </w:r>
+            <w:t>rojectNumber</w:t>
+          </w:r>
+          <w:proofErr w:type="spellEnd"/>
+          <w:r>
+            <w:t>} {</w:t>
+          </w:r>
+          <w:proofErr w:type="spellStart"/>
           <w:r>
             <w:t>p</w:t>
           </w:r>
           <w:r>
-            <w:t>rojectName}</w:t>
+            <w:t>rojectName</w:t>
+          </w:r>
+          <w:proofErr w:type="spellEnd"/>
+          <w:r>
+            <w:t>}</w:t>
           </w:r>
         </w:p>
         <w:p>
@@ -1060,23 +1021,38 @@
           <w:r>
             <w:t>{</w:t>
           </w:r>
+          <w:proofErr w:type="spellStart"/>
           <w:r>
             <w:t>a</w:t>
           </w:r>
           <w:r>
-            <w:t>pplicationNumber} Submittal {</w:t>
-          </w:r>
+            <w:t>pplicationNumber</w:t>
+          </w:r>
+          <w:proofErr w:type="spellEnd"/>
+          <w:r>
+            <w:t>} Submittal {</w:t>
+          </w:r>
+          <w:proofErr w:type="spellStart"/>
           <w:r>
             <w:t>s</w:t>
           </w:r>
           <w:r>
-            <w:t>ubmittalNumber} ({</w:t>
-          </w:r>
+            <w:t>ubmittalNumber</w:t>
+          </w:r>
+          <w:proofErr w:type="spellEnd"/>
+          <w:r>
+            <w:t>} ({</w:t>
+          </w:r>
+          <w:proofErr w:type="spellStart"/>
           <w:r>
             <w:t>s</w:t>
           </w:r>
           <w:r>
-            <w:t>ubmittalDate})</w:t>
+            <w:t>ubmittalDate</w:t>
+          </w:r>
+          <w:proofErr w:type="spellEnd"/>
+          <w:r>
+            <w:t>})</w:t>
           </w:r>
         </w:p>
       </w:tc>
@@ -1092,11 +1068,16 @@
           <w:r>
             <w:t>{</w:t>
           </w:r>
+          <w:proofErr w:type="spellStart"/>
           <w:r>
             <w:t>c</w:t>
           </w:r>
           <w:r>
-            <w:t>lientName}</w:t>
+            <w:t>lientName</w:t>
+          </w:r>
+          <w:proofErr w:type="spellEnd"/>
+          <w:r>
+            <w:t>}</w:t>
           </w:r>
         </w:p>
         <w:p>
@@ -1207,7 +1188,7 @@
 </file>
 
 <file path=word/footnotes.xml><?xml version="1.0" encoding="utf-8"?>
-<w:footnotes xmlns:wpc="http://schemas.microsoft.com/office/word/2010/wordprocessingCanvas" xmlns:cx="http://schemas.microsoft.com/office/drawing/2014/chartex" xmlns:cx1="http://schemas.microsoft.com/office/drawing/2015/9/8/chartex" xmlns:cx2="http://schemas.microsoft.com/office/drawing/2015/10/21/chartex" xmlns:cx3="http://schemas.microsoft.com/office/drawing/2016/5/9/chartex" xmlns:cx4="http://schemas.microsoft.com/office/drawing/2016/5/10/chartex" xmlns:cx5="http://schemas.microsoft.com/office/drawing/2016/5/11/chartex" xmlns:cx6="http://schemas.microsoft.com/office/drawing/2016/5/12/chartex" xmlns:cx7="http://schemas.microsoft.com/office/drawing/2016/5/13/chartex" xmlns:cx8="http://schemas.microsoft.com/office/drawing/2016/5/14/chartex" xmlns:mc="http://schemas.openxmlformats.org/markup-compatibility/2006" xmlns:aink="http://schemas.microsoft.com/office/drawing/2016/ink" xmlns:am3d="http://schemas.microsoft.com/office/drawing/2017/model3d" xmlns:o="urn:schemas-microsoft-com:office:office" xmlns:oel="http://schemas.microsoft.com/office/2019/extlst" xmlns:r="http://schemas.openxmlformats.org/officeDocument/2006/relationships" xmlns:m="http://schemas.openxmlformats.org/officeDocument/2006/math" xmlns:v="urn:schemas-microsoft-com:vml" xmlns:wp14="http://schemas.microsoft.com/office/word/2010/wordprocessingDrawing" xmlns:wp="http://schemas.openxmlformats.org/drawingml/2006/wordprocessingDrawing" xmlns:w10="urn:schemas-microsoft-com:office:word" xmlns:w="http://schemas.openxmlformats.org/wordprocessingml/2006/main" xmlns:w14="http://schemas.microsoft.com/office/word/2010/wordml" xmlns:w15="http://schemas.microsoft.com/office/word/2012/wordml" xmlns:w16cex="http://schemas.microsoft.com/office/word/2018/wordml/cex" xmlns:w16cid="http://schemas.microsoft.com/office/word/2016/wordml/cid" xmlns:w16="http://schemas.microsoft.com/office/word/2018/wordml" xmlns:w16du="http://schemas.microsoft.com/office/word/2023/wordml/word16du" xmlns:w16sdtdh="http://schemas.microsoft.com/office/word/2020/wordml/sdtdatahash" xmlns:w16sdtfl="http://schemas.microsoft.com/office/word/2024/wordml/sdtformatlock" xmlns:w16se="http://schemas.microsoft.com/office/word/2015/wordml/symex" xmlns:wpg="http://schemas.microsoft.com/office/word/2010/wordprocessingGroup" xmlns:wpi="http://schemas.microsoft.com/office/word/2010/wordprocessingInk" xmlns:wne="http://schemas.microsoft.com/office/word/2006/wordml" xmlns:wps="http://schemas.microsoft.com/office/word/2010/wordprocessingShape" mc:Ignorable="w14 w15 w16se w16cid w16 w16cex w16sdtdh w16sdtfl w16du wp14">
+<w:footnotes xmlns:wpc="http://schemas.microsoft.com/office/word/2010/wordprocessingCanvas" xmlns:cx="http://schemas.microsoft.com/office/drawing/2014/chartex" xmlns:cx1="http://schemas.microsoft.com/office/drawing/2015/9/8/chartex" xmlns:cx2="http://schemas.microsoft.com/office/drawing/2015/10/21/chartex" xmlns:cx3="http://schemas.microsoft.com/office/drawing/2016/5/9/chartex" xmlns:cx4="http://schemas.microsoft.com/office/drawing/2016/5/10/chartex" xmlns:cx5="http://schemas.microsoft.com/office/drawing/2016/5/11/chartex" xmlns:cx6="http://schemas.microsoft.com/office/drawing/2016/5/12/chartex" xmlns:cx7="http://schemas.microsoft.com/office/drawing/2016/5/13/chartex" xmlns:cx8="http://schemas.microsoft.com/office/drawing/2016/5/14/chartex" xmlns:mc="http://schemas.openxmlformats.org/markup-compatibility/2006" xmlns:aink="http://schemas.microsoft.com/office/drawing/2016/ink" xmlns:am3d="http://schemas.microsoft.com/office/drawing/2017/model3d" xmlns:o="urn:schemas-microsoft-com:office:office" xmlns:oel="http://schemas.microsoft.com/office/2019/extlst" xmlns:r="http://schemas.openxmlformats.org/officeDocument/2006/relationships" xmlns:m="http://schemas.openxmlformats.org/officeDocument/2006/math" xmlns:v="urn:schemas-microsoft-com:vml" xmlns:wp14="http://schemas.microsoft.com/office/word/2010/wordprocessingDrawing" xmlns:wp="http://schemas.openxmlformats.org/drawingml/2006/wordprocessingDrawing" xmlns:w10="urn:schemas-microsoft-com:office:word" xmlns:w="http://schemas.openxmlformats.org/wordprocessingml/2006/main" xmlns:w14="http://schemas.microsoft.com/office/word/2010/wordml" xmlns:w15="http://schemas.microsoft.com/office/word/2012/wordml" xmlns:w16cei="http://schemas.microsoft.com/office/word/2026/wordml/cei" xmlns:w16cex="http://schemas.microsoft.com/office/word/2018/wordml/cex" xmlns:w16cid="http://schemas.microsoft.com/office/word/2016/wordml/cid" xmlns:w16="http://schemas.microsoft.com/office/word/2018/wordml" xmlns:w16du="http://schemas.microsoft.com/office/word/2023/wordml/word16du" xmlns:w16sdtdh="http://schemas.microsoft.com/office/word/2020/wordml/sdtdatahash" xmlns:w16sdtfl="http://schemas.microsoft.com/office/word/2024/wordml/sdtformatlock" xmlns:w16se="http://schemas.microsoft.com/office/word/2015/wordml/symex" xmlns:wpg="http://schemas.microsoft.com/office/word/2010/wordprocessingGroup" xmlns:wpi="http://schemas.microsoft.com/office/word/2010/wordprocessingInk" xmlns:wne="http://schemas.microsoft.com/office/word/2006/wordml" xmlns:wps="http://schemas.microsoft.com/office/word/2010/wordprocessingShape" mc:Ignorable="w14 w15 w16se w16cid w16 w16cex w16sdtdh w16sdtfl w16du wp14">
   <w:footnote w:type="separator" w:id="-1">
     <w:p>
       <w:pPr>
@@ -2294,8 +2275,9 @@
     <w:basedOn w:val="ClosureReportText"/>
     <w:link w:val="ClosureReportHeaderChar"/>
     <w:qFormat/>
-    <w:rsid w:val="00E614AC"/>
+    <w:rsid w:val="00FE12AE"/>
     <w:pPr>
+      <w:spacing w:before="120"/>
       <w:jc w:val="center"/>
     </w:pPr>
     <w:rPr>
@@ -2306,7 +2288,7 @@
     <w:name w:val="Closure Report Header Char"/>
     <w:basedOn w:val="ClosureReportTextChar"/>
     <w:link w:val="ClosureReportHeader"/>
-    <w:rsid w:val="00E614AC"/>
+    <w:rsid w:val="00FE12AE"/>
     <w:rPr>
       <w:rFonts w:ascii="Courier New" w:hAnsi="Courier New"/>
       <w:b/>
@@ -2655,11 +2637,15 @@
 </file>
 
 <file path=customXml/item1.xml><?xml version="1.0" encoding="utf-8"?>
+<b:Sources xmlns:b="http://schemas.openxmlformats.org/officeDocument/2006/bibliography" xmlns="http://schemas.openxmlformats.org/officeDocument/2006/bibliography" SelectedStyle="\APASixthEditionOfficeOnline.xsl" StyleName="APA" Version="6"/>
+</file>
+
+<file path=customXml/item2.xml><?xml version="1.0" encoding="utf-8"?>
 <LotClosure>
 </LotClosure>
 </file>
 
-<file path=customXml/item2.xml><?xml version="1.0" encoding="utf-8"?>
+<file path=customXml/item3.xml><?xml version="1.0" encoding="utf-8"?>
 <LotClosure>
   <ClientName/>
   <ClientStreetAddress/>
@@ -2672,26 +2658,22 @@
 </LotClosure>
 </file>
 
-<file path=customXml/item3.xml><?xml version="1.0" encoding="utf-8"?>
-<b:Sources xmlns:b="http://schemas.openxmlformats.org/officeDocument/2006/bibliography" xmlns="http://schemas.openxmlformats.org/officeDocument/2006/bibliography" SelectedStyle="\APASixthEditionOfficeOnline.xsl" StyleName="APA" Version="6"/>
+<file path=customXml/itemProps1.xml><?xml version="1.0" encoding="utf-8"?>
+<ds:datastoreItem xmlns:ds="http://schemas.openxmlformats.org/officeDocument/2006/customXml" ds:itemID="{5738218A-D651-49C2-AE9F-0E7E45B33EDA}">
+  <ds:schemaRefs>
+    <ds:schemaRef ds:uri="http://schemas.openxmlformats.org/officeDocument/2006/bibliography"/>
+  </ds:schemaRefs>
+</ds:datastoreItem>
 </file>
 
-<file path=customXml/itemProps1.xml><?xml version="1.0" encoding="utf-8"?>
+<file path=customXml/itemProps2.xml><?xml version="1.0" encoding="utf-8"?>
 <ds:datastoreItem xmlns:ds="http://schemas.openxmlformats.org/officeDocument/2006/customXml" ds:itemID="{C9DDF8E2-AB4E-4616-9C13-EE8D225EE398}">
   <ds:schemaRefs/>
 </ds:datastoreItem>
 </file>
 
-<file path=customXml/itemProps2.xml><?xml version="1.0" encoding="utf-8"?>
+<file path=customXml/itemProps3.xml><?xml version="1.0" encoding="utf-8"?>
 <ds:datastoreItem xmlns:ds="http://schemas.openxmlformats.org/officeDocument/2006/customXml" ds:itemID="{6A2FE373-227A-476F-AB44-CB35A434D6D3}">
   <ds:schemaRefs/>
 </ds:datastoreItem>
-</file>
-
-<file path=customXml/itemProps3.xml><?xml version="1.0" encoding="utf-8"?>
-<ds:datastoreItem xmlns:ds="http://schemas.openxmlformats.org/officeDocument/2006/customXml" ds:itemID="{5738218A-D651-49C2-AE9F-0E7E45B33EDA}">
-  <ds:schemaRefs>
-    <ds:schemaRef ds:uri="http://schemas.openxmlformats.org/officeDocument/2006/bibliography"/>
-  </ds:schemaRefs>
-</ds:datastoreItem>
 </file>
</xml_diff>

<commit_message>
Merge cleanup into master
</commit_message>
<xml_diff>
--- a/sites/document/public/templates/lot-closure-report.docx
+++ b/sites/document/public/templates/lot-closure-report.docx
@@ -1,6 +1,6 @@
 
 <file path=word/document.xml><?xml version="1.0" encoding="utf-8"?>
-<w:document xmlns:wpc="http://schemas.microsoft.com/office/word/2010/wordprocessingCanvas" xmlns:cx="http://schemas.microsoft.com/office/drawing/2014/chartex" xmlns:cx1="http://schemas.microsoft.com/office/drawing/2015/9/8/chartex" xmlns:cx2="http://schemas.microsoft.com/office/drawing/2015/10/21/chartex" xmlns:cx3="http://schemas.microsoft.com/office/drawing/2016/5/9/chartex" xmlns:cx4="http://schemas.microsoft.com/office/drawing/2016/5/10/chartex" xmlns:cx5="http://schemas.microsoft.com/office/drawing/2016/5/11/chartex" xmlns:cx6="http://schemas.microsoft.com/office/drawing/2016/5/12/chartex" xmlns:cx7="http://schemas.microsoft.com/office/drawing/2016/5/13/chartex" xmlns:cx8="http://schemas.microsoft.com/office/drawing/2016/5/14/chartex" xmlns:mc="http://schemas.openxmlformats.org/markup-compatibility/2006" xmlns:aink="http://schemas.microsoft.com/office/drawing/2016/ink" xmlns:am3d="http://schemas.microsoft.com/office/drawing/2017/model3d" xmlns:o="urn:schemas-microsoft-com:office:office" xmlns:oel="http://schemas.microsoft.com/office/2019/extlst" xmlns:r="http://schemas.openxmlformats.org/officeDocument/2006/relationships" xmlns:m="http://schemas.openxmlformats.org/officeDocument/2006/math" xmlns:v="urn:schemas-microsoft-com:vml" xmlns:wp14="http://schemas.microsoft.com/office/word/2010/wordprocessingDrawing" xmlns:wp="http://schemas.openxmlformats.org/drawingml/2006/wordprocessingDrawing" xmlns:w10="urn:schemas-microsoft-com:office:word" xmlns:w="http://schemas.openxmlformats.org/wordprocessingml/2006/main" xmlns:w14="http://schemas.microsoft.com/office/word/2010/wordml" xmlns:w15="http://schemas.microsoft.com/office/word/2012/wordml" xmlns:w16cex="http://schemas.microsoft.com/office/word/2018/wordml/cex" xmlns:w16cid="http://schemas.microsoft.com/office/word/2016/wordml/cid" xmlns:w16="http://schemas.microsoft.com/office/word/2018/wordml" xmlns:w16du="http://schemas.microsoft.com/office/word/2023/wordml/word16du" xmlns:w16sdtdh="http://schemas.microsoft.com/office/word/2020/wordml/sdtdatahash" xmlns:w16sdtfl="http://schemas.microsoft.com/office/word/2024/wordml/sdtformatlock" xmlns:w16se="http://schemas.microsoft.com/office/word/2015/wordml/symex" xmlns:wpg="http://schemas.microsoft.com/office/word/2010/wordprocessingGroup" xmlns:wpi="http://schemas.microsoft.com/office/word/2010/wordprocessingInk" xmlns:wne="http://schemas.microsoft.com/office/word/2006/wordml" xmlns:wps="http://schemas.microsoft.com/office/word/2010/wordprocessingShape" mc:Ignorable="w14 w15 w16se w16cid w16 w16cex w16sdtdh w16sdtfl w16du wp14">
+<w:document xmlns:wpc="http://schemas.microsoft.com/office/word/2010/wordprocessingCanvas" xmlns:cx="http://schemas.microsoft.com/office/drawing/2014/chartex" xmlns:cx1="http://schemas.microsoft.com/office/drawing/2015/9/8/chartex" xmlns:cx2="http://schemas.microsoft.com/office/drawing/2015/10/21/chartex" xmlns:cx3="http://schemas.microsoft.com/office/drawing/2016/5/9/chartex" xmlns:cx4="http://schemas.microsoft.com/office/drawing/2016/5/10/chartex" xmlns:cx5="http://schemas.microsoft.com/office/drawing/2016/5/11/chartex" xmlns:cx6="http://schemas.microsoft.com/office/drawing/2016/5/12/chartex" xmlns:cx7="http://schemas.microsoft.com/office/drawing/2016/5/13/chartex" xmlns:cx8="http://schemas.microsoft.com/office/drawing/2016/5/14/chartex" xmlns:mc="http://schemas.openxmlformats.org/markup-compatibility/2006" xmlns:aink="http://schemas.microsoft.com/office/drawing/2016/ink" xmlns:am3d="http://schemas.microsoft.com/office/drawing/2017/model3d" xmlns:o="urn:schemas-microsoft-com:office:office" xmlns:oel="http://schemas.microsoft.com/office/2019/extlst" xmlns:r="http://schemas.openxmlformats.org/officeDocument/2006/relationships" xmlns:m="http://schemas.openxmlformats.org/officeDocument/2006/math" xmlns:v="urn:schemas-microsoft-com:vml" xmlns:wp14="http://schemas.microsoft.com/office/word/2010/wordprocessingDrawing" xmlns:wp="http://schemas.openxmlformats.org/drawingml/2006/wordprocessingDrawing" xmlns:w10="urn:schemas-microsoft-com:office:word" xmlns:w="http://schemas.openxmlformats.org/wordprocessingml/2006/main" xmlns:w14="http://schemas.microsoft.com/office/word/2010/wordml" xmlns:w15="http://schemas.microsoft.com/office/word/2012/wordml" xmlns:w16cei="http://schemas.microsoft.com/office/word/2026/wordml/cei" xmlns:w16cex="http://schemas.microsoft.com/office/word/2018/wordml/cex" xmlns:w16cid="http://schemas.microsoft.com/office/word/2016/wordml/cid" xmlns:w16="http://schemas.microsoft.com/office/word/2018/wordml" xmlns:w16du="http://schemas.microsoft.com/office/word/2023/wordml/word16du" xmlns:w16sdtdh="http://schemas.microsoft.com/office/word/2020/wordml/sdtdatahash" xmlns:w16sdtfl="http://schemas.microsoft.com/office/word/2024/wordml/sdtformatlock" xmlns:w16se="http://schemas.microsoft.com/office/word/2015/wordml/symex" xmlns:wpg="http://schemas.microsoft.com/office/word/2010/wordprocessingGroup" xmlns:wpi="http://schemas.microsoft.com/office/word/2010/wordprocessingInk" xmlns:wne="http://schemas.microsoft.com/office/word/2006/wordml" xmlns:wps="http://schemas.microsoft.com/office/word/2010/wordprocessingShape" mc:Ignorable="w14 w15 w16se w16cid w16 w16cex w16sdtdh w16sdtfl w16du wp14">
   <w:body>
     <w:p>
       <w:pPr>
@@ -76,559 +76,463 @@
       </w:r>
     </w:p>
     <w:p/>
+    <w:p>
+      <w:pPr>
+        <w:spacing w:line="240" w:lineRule="auto"/>
+        <w:jc w:val="center"/>
+        <w:rPr>
+          <w:b/>
+          <w:bCs/>
+          <w:color w:val="1C3D5A"/>
+        </w:rPr>
+      </w:pPr>
+      <w:r>
+        <w:rPr>
+          <w:b/>
+          <w:bCs/>
+          <w:color w:val="1C3D5A"/>
+        </w:rPr>
+        <w:t>PROJECT INFORMATION</w:t>
+      </w:r>
+    </w:p>
+    <w:p>
+      <w:pPr>
+        <w:spacing w:after="0" w:line="240" w:lineRule="auto"/>
+        <w:jc w:val="center"/>
+        <w:rPr>
+          <w:b/>
+          <w:bCs/>
+        </w:rPr>
+      </w:pPr>
+      <w:r>
+        <w:t xml:space="preserve">Project </w:t>
+      </w:r>
+      <w:proofErr w:type="gramStart"/>
+      <w:r>
+        <w:t xml:space="preserve">Number: </w:t>
+      </w:r>
+      <w:r>
+        <w:rPr>
+          <w:b/>
+          <w:bCs/>
+        </w:rPr>
+        <w:t>{</w:t>
+      </w:r>
+      <w:proofErr w:type="spellStart"/>
+      <w:proofErr w:type="gramEnd"/>
+      <w:r>
+        <w:rPr>
+          <w:b/>
+          <w:bCs/>
+        </w:rPr>
+        <w:t>projectNumber</w:t>
+      </w:r>
+      <w:proofErr w:type="spellEnd"/>
+      <w:r>
+        <w:rPr>
+          <w:b/>
+          <w:bCs/>
+        </w:rPr>
+        <w:t>}</w:t>
+      </w:r>
+    </w:p>
+    <w:p>
+      <w:pPr>
+        <w:spacing w:after="0" w:line="240" w:lineRule="auto"/>
+        <w:jc w:val="center"/>
+        <w:rPr>
+          <w:b/>
+        </w:rPr>
+      </w:pPr>
+      <w:r>
+        <w:rPr>
+          <w:bCs/>
+        </w:rPr>
+        <w:t xml:space="preserve">Application #: </w:t>
+      </w:r>
+      <w:r>
+        <w:rPr>
+          <w:b/>
+        </w:rPr>
+        <w:t>{</w:t>
+      </w:r>
+      <w:proofErr w:type="spellStart"/>
+      <w:r>
+        <w:rPr>
+          <w:b/>
+        </w:rPr>
+        <w:t>applicationNumber</w:t>
+      </w:r>
+      <w:proofErr w:type="spellEnd"/>
+      <w:r>
+        <w:rPr>
+          <w:b/>
+        </w:rPr>
+        <w:t>}</w:t>
+      </w:r>
+    </w:p>
+    <w:p>
+      <w:pPr>
+        <w:spacing w:after="0" w:line="240" w:lineRule="auto"/>
+        <w:jc w:val="center"/>
+        <w:rPr>
+          <w:b/>
+        </w:rPr>
+      </w:pPr>
+      <w:proofErr w:type="gramStart"/>
+      <w:r>
+        <w:rPr>
+          <w:bCs/>
+        </w:rPr>
+        <w:t xml:space="preserve">Submittal #: </w:t>
+      </w:r>
+      <w:r>
+        <w:rPr>
+          <w:b/>
+        </w:rPr>
+        <w:t>{</w:t>
+      </w:r>
+      <w:proofErr w:type="spellStart"/>
+      <w:proofErr w:type="gramEnd"/>
+      <w:r>
+        <w:rPr>
+          <w:b/>
+        </w:rPr>
+        <w:t>submittalNumber</w:t>
+      </w:r>
+      <w:proofErr w:type="spellEnd"/>
+      <w:r>
+        <w:rPr>
+          <w:b/>
+        </w:rPr>
+        <w:t>}</w:t>
+      </w:r>
+    </w:p>
+    <w:p>
+      <w:pPr>
+        <w:spacing w:after="0" w:line="240" w:lineRule="auto"/>
+        <w:jc w:val="center"/>
+        <w:rPr>
+          <w:b/>
+        </w:rPr>
+      </w:pPr>
+      <w:r>
+        <w:rPr>
+          <w:bCs/>
+        </w:rPr>
+        <w:t xml:space="preserve">Report Date: </w:t>
+      </w:r>
+      <w:r>
+        <w:rPr>
+          <w:b/>
+        </w:rPr>
+        <w:t>{</w:t>
+      </w:r>
+      <w:proofErr w:type="spellStart"/>
+      <w:r>
+        <w:rPr>
+          <w:b/>
+        </w:rPr>
+        <w:t>submittalDate</w:t>
+      </w:r>
+      <w:proofErr w:type="spellEnd"/>
+      <w:r>
+        <w:rPr>
+          <w:b/>
+        </w:rPr>
+        <w:t>}</w:t>
+      </w:r>
+    </w:p>
+    <w:p>
+      <w:pPr>
+        <w:jc w:val="center"/>
+      </w:pPr>
+      <w:r>
+        <w:rPr>
+          <w:bCs/>
+        </w:rPr>
+        <w:t xml:space="preserve">Report Pages: </w:t>
+      </w:r>
+      <w:r>
+        <w:rPr>
+          <w:b/>
+        </w:rPr>
+        <w:fldChar w:fldCharType="begin"/>
+      </w:r>
+      <w:r>
+        <w:rPr>
+          <w:b/>
+        </w:rPr>
+        <w:instrText xml:space="preserve"> NUMPAGES  \# "0 'Pages'" \* Arabic  \* MERGEFORMAT </w:instrText>
+      </w:r>
+      <w:r>
+        <w:rPr>
+          <w:b/>
+        </w:rPr>
+        <w:fldChar w:fldCharType="separate"/>
+      </w:r>
+      <w:r>
+        <w:rPr>
+          <w:b/>
+          <w:noProof/>
+        </w:rPr>
+        <w:t>1</w:t>
+      </w:r>
+      <w:r>
+        <w:rPr>
+          <w:b/>
+        </w:rPr>
+        <w:fldChar w:fldCharType="end"/>
+      </w:r>
+      <w:r>
+        <w:rPr>
+          <w:b/>
+        </w:rPr>
+        <w:t xml:space="preserve"> Pages</w:t>
+      </w:r>
+    </w:p>
     <w:p/>
-    <w:tbl>
-      <w:tblPr>
-        <w:tblStyle w:val="TableGrid"/>
-        <w:tblW w:w="0" w:type="auto"/>
-        <w:tblBorders>
-          <w:top w:val="none" w:sz="0" w:space="0" w:color="auto"/>
-          <w:left w:val="none" w:sz="0" w:space="0" w:color="auto"/>
-          <w:bottom w:val="none" w:sz="0" w:space="0" w:color="auto"/>
-          <w:right w:val="none" w:sz="0" w:space="0" w:color="auto"/>
-          <w:insideH w:val="none" w:sz="0" w:space="0" w:color="auto"/>
-          <w:insideV w:val="none" w:sz="0" w:space="0" w:color="auto"/>
-        </w:tblBorders>
-        <w:tblLook w:val="04A0" w:firstRow="1" w:lastRow="0" w:firstColumn="1" w:lastColumn="0" w:noHBand="0" w:noVBand="1"/>
-      </w:tblPr>
-      <w:tblGrid>
-        <w:gridCol w:w="3510"/>
-        <w:gridCol w:w="3600"/>
-        <w:gridCol w:w="3680"/>
-      </w:tblGrid>
-      <w:tr>
-        <w:tc>
-          <w:tcPr>
-            <w:tcW w:w="3510" w:type="dxa"/>
-          </w:tcPr>
-          <w:p>
-            <w:pPr>
-              <w:spacing w:line="240" w:lineRule="auto"/>
-              <w:jc w:val="center"/>
-              <w:rPr>
-                <w:b/>
-                <w:bCs/>
-                <w:color w:val="1C3D5A"/>
-              </w:rPr>
-            </w:pPr>
-            <w:r>
-              <w:rPr>
-                <w:b/>
-                <w:bCs/>
-                <w:color w:val="1C3D5A"/>
-              </w:rPr>
-              <w:t>PROJECT INFORMATION</w:t>
-            </w:r>
-          </w:p>
-          <w:p>
-            <w:pPr>
-              <w:spacing w:after="0" w:line="240" w:lineRule="auto"/>
-              <w:jc w:val="center"/>
-              <w:rPr>
-                <w:b/>
-                <w:bCs/>
-              </w:rPr>
-            </w:pPr>
-            <w:r>
-              <w:t xml:space="preserve">Project </w:t>
-            </w:r>
-            <w:proofErr w:type="gramStart"/>
-            <w:r>
-              <w:t xml:space="preserve">Number: </w:t>
-            </w:r>
-            <w:r>
-              <w:rPr>
-                <w:b/>
-                <w:bCs/>
-              </w:rPr>
-              <w:t>{</w:t>
-            </w:r>
-            <w:proofErr w:type="gramEnd"/>
-            <w:r>
-              <w:rPr>
-                <w:b/>
-                <w:bCs/>
-              </w:rPr>
-              <w:t>projectNumber</w:t>
-            </w:r>
-            <w:r>
-              <w:rPr>
-                <w:b/>
-                <w:bCs/>
-              </w:rPr>
-              <w:t>}</w:t>
-            </w:r>
-          </w:p>
-          <w:p>
-            <w:pPr>
-              <w:spacing w:after="0" w:line="240" w:lineRule="auto"/>
-              <w:jc w:val="center"/>
-              <w:rPr>
-                <w:b/>
-              </w:rPr>
-            </w:pPr>
-            <w:r>
-              <w:rPr>
-                <w:bCs/>
-              </w:rPr>
-              <w:t xml:space="preserve">Application #: </w:t>
-            </w:r>
-            <w:r>
-              <w:rPr>
-                <w:b/>
-              </w:rPr>
-              <w:t>{</w:t>
-            </w:r>
-            <w:r>
-              <w:rPr>
-                <w:b/>
-              </w:rPr>
-              <w:t>a</w:t>
-            </w:r>
-            <w:r>
-              <w:rPr>
-                <w:b/>
-              </w:rPr>
-              <w:t>pplicationNumber}</w:t>
-            </w:r>
-          </w:p>
-          <w:p>
-            <w:pPr>
-              <w:spacing w:after="0" w:line="240" w:lineRule="auto"/>
-              <w:jc w:val="center"/>
-              <w:rPr>
-                <w:b/>
-              </w:rPr>
-            </w:pPr>
-            <w:proofErr w:type="gramStart"/>
-            <w:r>
-              <w:rPr>
-                <w:bCs/>
-              </w:rPr>
-              <w:t>Submittal</w:t>
-            </w:r>
-            <w:r>
-              <w:rPr>
-                <w:bCs/>
-              </w:rPr>
-              <w:t xml:space="preserve"> #: </w:t>
-            </w:r>
-            <w:r>
-              <w:rPr>
-                <w:b/>
-              </w:rPr>
-              <w:t>{</w:t>
-            </w:r>
-            <w:proofErr w:type="gramEnd"/>
-            <w:r>
-              <w:rPr>
-                <w:b/>
-              </w:rPr>
-              <w:t>s</w:t>
-            </w:r>
-            <w:r>
-              <w:rPr>
-                <w:b/>
-              </w:rPr>
-              <w:t>ubmittalNumber}</w:t>
-            </w:r>
-          </w:p>
-          <w:p>
-            <w:pPr>
-              <w:spacing w:after="0" w:line="240" w:lineRule="auto"/>
-              <w:jc w:val="center"/>
-              <w:rPr>
-                <w:b/>
-              </w:rPr>
-            </w:pPr>
-            <w:r>
-              <w:rPr>
-                <w:bCs/>
-              </w:rPr>
-              <w:t xml:space="preserve">Report Date: </w:t>
-            </w:r>
-            <w:r>
-              <w:rPr>
-                <w:b/>
-              </w:rPr>
-              <w:t>{</w:t>
-            </w:r>
-            <w:r>
-              <w:rPr>
-                <w:b/>
-              </w:rPr>
-              <w:t>s</w:t>
-            </w:r>
-            <w:r>
-              <w:rPr>
-                <w:b/>
-              </w:rPr>
-              <w:t>ubmittalDate}</w:t>
-            </w:r>
-          </w:p>
-          <w:p>
-            <w:pPr>
-              <w:spacing w:after="0" w:line="240" w:lineRule="auto"/>
-              <w:jc w:val="center"/>
-              <w:rPr>
-                <w:bCs/>
-              </w:rPr>
-            </w:pPr>
-            <w:r>
-              <w:rPr>
-                <w:bCs/>
-              </w:rPr>
-              <w:t xml:space="preserve">Report Pages: </w:t>
-            </w:r>
-            <w:r>
-              <w:rPr>
-                <w:b/>
-              </w:rPr>
-              <w:fldChar w:fldCharType="begin"/>
-            </w:r>
-            <w:r>
-              <w:rPr>
-                <w:b/>
-              </w:rPr>
-              <w:instrText xml:space="preserve"> NUMPAGES  \# "0 'Pages'" \* Arabic  \* MERGEFORMAT </w:instrText>
-            </w:r>
-            <w:r>
-              <w:rPr>
-                <w:b/>
-              </w:rPr>
-              <w:fldChar w:fldCharType="separate"/>
-            </w:r>
-            <w:r>
-              <w:rPr>
-                <w:b/>
-                <w:noProof/>
-              </w:rPr>
-              <w:t>3</w:t>
-            </w:r>
-            <w:r>
-              <w:rPr>
-                <w:b/>
-              </w:rPr>
-              <w:fldChar w:fldCharType="end"/>
-            </w:r>
-            <w:r>
-              <w:rPr>
-                <w:b/>
-              </w:rPr>
-              <w:t xml:space="preserve"> Pages</w:t>
-            </w:r>
-          </w:p>
-        </w:tc>
-        <w:tc>
-          <w:tcPr>
-            <w:tcW w:w="3600" w:type="dxa"/>
-          </w:tcPr>
-          <w:p>
-            <w:pPr>
-              <w:spacing w:line="240" w:lineRule="auto"/>
-              <w:jc w:val="center"/>
-              <w:rPr>
-                <w:b/>
-                <w:bCs/>
-                <w:color w:val="1C3D5A"/>
-              </w:rPr>
-            </w:pPr>
-            <w:r>
-              <w:rPr>
-                <w:b/>
-                <w:bCs/>
-                <w:color w:val="1C3D5A"/>
-              </w:rPr>
-              <w:t>OWNER INFORMATION</w:t>
-            </w:r>
-          </w:p>
-          <w:p>
-            <w:pPr>
-              <w:spacing w:after="0" w:line="240" w:lineRule="auto"/>
-              <w:jc w:val="center"/>
-              <w:rPr>
-                <w:b/>
-                <w:bCs/>
-                <w:color w:val="1C3D5A"/>
-              </w:rPr>
-            </w:pPr>
-            <w:r>
-              <w:rPr>
-                <w:b/>
-                <w:bCs/>
-                <w:color w:val="1C3D5A"/>
-              </w:rPr>
-              <w:t>{</w:t>
-            </w:r>
-            <w:r>
-              <w:rPr>
-                <w:b/>
-                <w:bCs/>
-                <w:color w:val="1C3D5A"/>
-              </w:rPr>
-              <w:t>c</w:t>
-            </w:r>
-            <w:r>
-              <w:rPr>
-                <w:b/>
-                <w:bCs/>
-                <w:color w:val="1C3D5A"/>
-              </w:rPr>
-              <w:t>lientName}</w:t>
-            </w:r>
-          </w:p>
-          <w:p>
-            <w:pPr>
-              <w:spacing w:after="0" w:line="240" w:lineRule="auto"/>
-              <w:jc w:val="center"/>
-              <w:rPr>
-                <w:color w:val="1C3D5A"/>
-              </w:rPr>
-            </w:pPr>
-            <w:r>
-              <w:rPr>
-                <w:color w:val="1C3D5A"/>
-              </w:rPr>
-              <w:t>{</w:t>
-            </w:r>
-            <w:r>
-              <w:rPr>
-                <w:color w:val="1C3D5A"/>
-              </w:rPr>
-              <w:t>c</w:t>
-            </w:r>
-            <w:r>
-              <w:rPr>
-                <w:color w:val="1C3D5A"/>
-              </w:rPr>
-              <w:t>lientAddress}</w:t>
-            </w:r>
-          </w:p>
-          <w:p>
-            <w:pPr>
-              <w:spacing w:after="0" w:line="240" w:lineRule="auto"/>
-              <w:jc w:val="center"/>
-              <w:rPr>
-                <w:color w:val="1C3D5A"/>
-              </w:rPr>
-            </w:pPr>
-            <w:proofErr w:type="gramStart"/>
-            <w:r>
-              <w:rPr>
-                <w:color w:val="1C3D5A"/>
-              </w:rPr>
-              <w:t>{</w:t>
-            </w:r>
-            <w:r>
-              <w:rPr>
-                <w:color w:val="1C3D5A"/>
-              </w:rPr>
-              <w:t>c</w:t>
-            </w:r>
-            <w:r>
-              <w:rPr>
-                <w:color w:val="1C3D5A"/>
-              </w:rPr>
-              <w:t>lientCity</w:t>
-            </w:r>
-            <w:r>
-              <w:rPr>
-                <w:color w:val="1C3D5A"/>
-              </w:rPr>
-              <w:t>}, {</w:t>
-            </w:r>
-            <w:proofErr w:type="gramEnd"/>
-            <w:r>
-              <w:rPr>
-                <w:color w:val="1C3D5A"/>
-              </w:rPr>
-              <w:t>client</w:t>
-            </w:r>
-            <w:r>
-              <w:rPr>
-                <w:color w:val="1C3D5A"/>
-              </w:rPr>
-              <w:t>State</w:t>
-            </w:r>
-            <w:r>
-              <w:rPr>
-                <w:color w:val="1C3D5A"/>
-              </w:rPr>
-              <w:t>} {client</w:t>
-            </w:r>
-            <w:r>
-              <w:rPr>
-                <w:color w:val="1C3D5A"/>
-              </w:rPr>
-              <w:t>Zip}</w:t>
-            </w:r>
-          </w:p>
-        </w:tc>
-        <w:tc>
-          <w:tcPr>
-            <w:tcW w:w="3680" w:type="dxa"/>
-          </w:tcPr>
-          <w:p>
-            <w:pPr>
-              <w:spacing w:line="240" w:lineRule="auto"/>
-              <w:jc w:val="center"/>
-              <w:rPr>
-                <w:b/>
-                <w:bCs/>
-                <w:color w:val="1C3D5A"/>
-              </w:rPr>
-            </w:pPr>
-            <w:r>
-              <w:rPr>
-                <w:b/>
-                <w:bCs/>
-                <w:color w:val="1C3D5A"/>
-              </w:rPr>
-              <w:t>PREPARER INFORMATION</w:t>
-            </w:r>
-          </w:p>
-          <w:p>
-            <w:pPr>
-              <w:spacing w:after="0" w:line="240" w:lineRule="auto"/>
-              <w:jc w:val="center"/>
-              <w:rPr>
-                <w:b/>
-                <w:bCs/>
-                <w:color w:val="1C3D5A"/>
-              </w:rPr>
-            </w:pPr>
-            <w:r>
-              <w:rPr>
-                <w:b/>
-                <w:bCs/>
-                <w:color w:val="1C3D5A"/>
-              </w:rPr>
-              <w:t>White Point Surveying &amp; Mapping</w:t>
-            </w:r>
-          </w:p>
-          <w:p>
-            <w:pPr>
-              <w:spacing w:after="0" w:line="240" w:lineRule="auto"/>
-              <w:jc w:val="center"/>
-              <w:rPr>
-                <w:color w:val="1C3D5A"/>
-              </w:rPr>
-            </w:pPr>
-            <w:r>
-              <w:rPr>
-                <w:color w:val="1C3D5A"/>
-              </w:rPr>
-              <w:t>642 Crimson Ct</w:t>
-            </w:r>
-          </w:p>
-          <w:p>
-            <w:pPr>
-              <w:spacing w:after="0" w:line="240" w:lineRule="auto"/>
-              <w:jc w:val="center"/>
-              <w:rPr>
-                <w:color w:val="1C3D5A"/>
-              </w:rPr>
-            </w:pPr>
-            <w:r>
-              <w:rPr>
-                <w:color w:val="1C3D5A"/>
-              </w:rPr>
-              <w:t>Altamonte Springs, FL 32701</w:t>
-            </w:r>
-          </w:p>
-          <w:p>
-            <w:pPr>
-              <w:spacing w:after="0" w:line="240" w:lineRule="auto"/>
-              <w:jc w:val="center"/>
-              <w:rPr>
-                <w:color w:val="1C3D5A"/>
-              </w:rPr>
-            </w:pPr>
-            <w:r>
-              <w:rPr>
-                <w:color w:val="1C3D5A"/>
-              </w:rPr>
-              <w:t>Licensed Business #8700</w:t>
-            </w:r>
-          </w:p>
-          <w:p>
-            <w:pPr>
-              <w:spacing w:after="0" w:line="240" w:lineRule="auto"/>
-              <w:jc w:val="center"/>
-              <w:rPr>
-                <w:color w:val="1C3D5A"/>
-              </w:rPr>
-            </w:pPr>
-            <w:proofErr w:type="gramStart"/>
-            <w:r>
-              <w:rPr>
-                <w:color w:val="1C3D5A"/>
-              </w:rPr>
-              <w:t xml:space="preserve">Surveyor: </w:t>
-            </w:r>
-            <w:r>
-              <w:rPr>
-                <w:b/>
-                <w:bCs/>
-                <w:color w:val="1C3D5A"/>
-              </w:rPr>
-              <w:t>{</w:t>
-            </w:r>
-            <w:proofErr w:type="gramEnd"/>
-            <w:r>
-              <w:rPr>
-                <w:b/>
-                <w:bCs/>
-                <w:color w:val="1C3D5A"/>
-              </w:rPr>
-              <w:t>surveyorName}</w:t>
-            </w:r>
-          </w:p>
-          <w:p>
-            <w:pPr>
-              <w:spacing w:after="0" w:line="240" w:lineRule="auto"/>
-              <w:jc w:val="center"/>
-              <w:rPr>
-                <w:b/>
-                <w:bCs/>
-                <w:color w:val="1C3D5A"/>
-              </w:rPr>
-            </w:pPr>
-            <w:r>
-              <w:rPr>
-                <w:color w:val="1C3D5A"/>
-              </w:rPr>
-              <w:t xml:space="preserve">Preparer: </w:t>
-            </w:r>
-            <w:r>
-              <w:rPr>
-                <w:b/>
-                <w:bCs/>
-                <w:color w:val="1C3D5A"/>
-              </w:rPr>
-              <w:t>{preparerName}</w:t>
-            </w:r>
-          </w:p>
-        </w:tc>
-      </w:tr>
-    </w:tbl>
+    <w:p>
+      <w:pPr>
+        <w:spacing w:line="240" w:lineRule="auto"/>
+        <w:jc w:val="center"/>
+        <w:rPr>
+          <w:b/>
+          <w:bCs/>
+          <w:color w:val="1C3D5A"/>
+        </w:rPr>
+      </w:pPr>
+      <w:r>
+        <w:rPr>
+          <w:b/>
+          <w:bCs/>
+          <w:color w:val="1C3D5A"/>
+        </w:rPr>
+        <w:t>OWNER INFORMATION</w:t>
+      </w:r>
+    </w:p>
+    <w:p>
+      <w:pPr>
+        <w:spacing w:after="0" w:line="240" w:lineRule="auto"/>
+        <w:jc w:val="center"/>
+        <w:rPr>
+          <w:b/>
+          <w:bCs/>
+        </w:rPr>
+      </w:pPr>
+      <w:r>
+        <w:rPr>
+          <w:b/>
+          <w:bCs/>
+        </w:rPr>
+        <w:t>{</w:t>
+      </w:r>
+      <w:proofErr w:type="spellStart"/>
+      <w:r>
+        <w:rPr>
+          <w:b/>
+          <w:bCs/>
+        </w:rPr>
+        <w:t>clientName</w:t>
+      </w:r>
+      <w:proofErr w:type="spellEnd"/>
+      <w:r>
+        <w:rPr>
+          <w:b/>
+          <w:bCs/>
+        </w:rPr>
+        <w:t>}</w:t>
+      </w:r>
+    </w:p>
+    <w:p>
+      <w:pPr>
+        <w:spacing w:after="0" w:line="240" w:lineRule="auto"/>
+        <w:jc w:val="center"/>
+      </w:pPr>
+      <w:r>
+        <w:t>{</w:t>
+      </w:r>
+      <w:proofErr w:type="spellStart"/>
+      <w:r>
+        <w:t>clientAddress</w:t>
+      </w:r>
+      <w:proofErr w:type="spellEnd"/>
+      <w:r>
+        <w:t>}</w:t>
+      </w:r>
+    </w:p>
+    <w:p>
+      <w:pPr>
+        <w:jc w:val="center"/>
+      </w:pPr>
+      <w:proofErr w:type="gramStart"/>
+      <w:r>
+        <w:t>{</w:t>
+      </w:r>
+      <w:proofErr w:type="spellStart"/>
+      <w:r>
+        <w:t>clientCity</w:t>
+      </w:r>
+      <w:proofErr w:type="spellEnd"/>
+      <w:r>
+        <w:t>}, {</w:t>
+      </w:r>
+      <w:proofErr w:type="spellStart"/>
+      <w:proofErr w:type="gramEnd"/>
+      <w:r>
+        <w:t>clientState</w:t>
+      </w:r>
+      <w:proofErr w:type="spellEnd"/>
+      <w:r>
+        <w:t>} {</w:t>
+      </w:r>
+      <w:proofErr w:type="spellStart"/>
+      <w:r>
+        <w:t>clientZip</w:t>
+      </w:r>
+      <w:proofErr w:type="spellEnd"/>
+      <w:r>
+        <w:t>}</w:t>
+      </w:r>
+    </w:p>
     <w:p/>
-    <w:p/>
-    <w:p/>
-    <w:p/>
-    <w:p/>
-    <w:p/>
-    <w:p/>
-    <w:p/>
+    <w:p>
+      <w:pPr>
+        <w:spacing w:line="240" w:lineRule="auto"/>
+        <w:jc w:val="center"/>
+        <w:rPr>
+          <w:b/>
+          <w:bCs/>
+          <w:color w:val="1C3D5A"/>
+        </w:rPr>
+      </w:pPr>
+      <w:r>
+        <w:rPr>
+          <w:b/>
+          <w:bCs/>
+          <w:color w:val="1C3D5A"/>
+        </w:rPr>
+        <w:t>PREPARER INFORMATION</w:t>
+      </w:r>
+    </w:p>
+    <w:p>
+      <w:pPr>
+        <w:spacing w:after="0" w:line="240" w:lineRule="auto"/>
+        <w:jc w:val="center"/>
+        <w:rPr>
+          <w:b/>
+          <w:bCs/>
+        </w:rPr>
+      </w:pPr>
+      <w:r>
+        <w:rPr>
+          <w:b/>
+          <w:bCs/>
+        </w:rPr>
+        <w:t>White Point Surveying &amp; Mapping</w:t>
+      </w:r>
+    </w:p>
+    <w:p>
+      <w:pPr>
+        <w:spacing w:after="0" w:line="240" w:lineRule="auto"/>
+        <w:jc w:val="center"/>
+      </w:pPr>
+      <w:r>
+        <w:t>642 Crimson Ct</w:t>
+      </w:r>
+    </w:p>
+    <w:p>
+      <w:pPr>
+        <w:spacing w:after="0" w:line="240" w:lineRule="auto"/>
+        <w:jc w:val="center"/>
+      </w:pPr>
+      <w:r>
+        <w:t>Altamonte Springs, FL 32701</w:t>
+      </w:r>
+    </w:p>
+    <w:p>
+      <w:pPr>
+        <w:spacing w:after="0" w:line="240" w:lineRule="auto"/>
+        <w:jc w:val="center"/>
+      </w:pPr>
+      <w:r>
+        <w:t>Licensed Business #8700</w:t>
+      </w:r>
+    </w:p>
+    <w:p>
+      <w:pPr>
+        <w:spacing w:after="0" w:line="240" w:lineRule="auto"/>
+        <w:jc w:val="center"/>
+      </w:pPr>
+      <w:proofErr w:type="gramStart"/>
+      <w:r>
+        <w:t xml:space="preserve">Surveyor: </w:t>
+      </w:r>
+      <w:r>
+        <w:rPr>
+          <w:b/>
+          <w:bCs/>
+        </w:rPr>
+        <w:t>{</w:t>
+      </w:r>
+      <w:proofErr w:type="spellStart"/>
+      <w:proofErr w:type="gramEnd"/>
+      <w:r>
+        <w:rPr>
+          <w:b/>
+          <w:bCs/>
+        </w:rPr>
+        <w:t>surveyorName</w:t>
+      </w:r>
+      <w:proofErr w:type="spellEnd"/>
+      <w:r>
+        <w:rPr>
+          <w:b/>
+          <w:bCs/>
+        </w:rPr>
+        <w:t>}</w:t>
+      </w:r>
+    </w:p>
     <w:p>
       <w:pPr>
         <w:tabs>
           <w:tab w:val="left" w:pos="5950"/>
         </w:tabs>
-      </w:pPr>
-      <w:r>
-        <w:tab/>
-      </w:r>
+        <w:jc w:val="center"/>
+      </w:pPr>
+      <w:r>
+        <w:t xml:space="preserve">Preparer: </w:t>
+      </w:r>
+      <w:r>
+        <w:rPr>
+          <w:b/>
+          <w:bCs/>
+        </w:rPr>
+        <w:t>{</w:t>
+      </w:r>
+      <w:proofErr w:type="spellStart"/>
+      <w:r>
+        <w:rPr>
+          <w:b/>
+          <w:bCs/>
+        </w:rPr>
+        <w:t>preparerName</w:t>
+      </w:r>
+      <w:proofErr w:type="spellEnd"/>
+      <w:r>
+        <w:rPr>
+          <w:b/>
+          <w:bCs/>
+        </w:rPr>
+        <w:t>}</w:t>
+      </w:r>
+    </w:p>
+    <w:p>
+      <w:pPr>
+        <w:tabs>
+          <w:tab w:val="left" w:pos="5950"/>
+        </w:tabs>
+      </w:pPr>
     </w:p>
     <w:p>
       <w:pPr>
@@ -648,9 +552,6 @@
           <w:docGrid w:linePitch="360"/>
         </w:sectPr>
       </w:pPr>
-      <w:r>
-        <w:tab/>
-      </w:r>
     </w:p>
     <w:p>
       <w:pPr>
@@ -726,10 +627,12 @@
         </w:r>
         <w:r>
           <w:rPr>
+            <w:b/>
+            <w:bCs/>
             <w:noProof/>
             <w:webHidden/>
           </w:rPr>
-          <w:t>3</w:t>
+          <w:t>Error! Bookmark not defined.</w:t>
         </w:r>
         <w:r>
           <w:rPr>
@@ -762,16 +665,34 @@
       </w:pPr>
       <w:r>
         <w:lastRenderedPageBreak/>
-        <w:t>{</w:t>
-      </w:r>
-      <w:r>
-        <w:t>report</w:t>
-      </w:r>
-      <w:r>
-        <w:t>}</w:t>
-      </w:r>
-      <w:r>
-        <w:t xml:space="preserve"> </w:t>
+        <w:t>{#closures}</w:t>
+      </w:r>
+    </w:p>
+    <w:p>
+      <w:pPr>
+        <w:pStyle w:val="ClosureReportHeader"/>
+      </w:pPr>
+      <w:r>
+        <w:t>{name}</w:t>
+      </w:r>
+    </w:p>
+    <w:p>
+      <w:pPr>
+        <w:pStyle w:val="ClosureReportText"/>
+        <w:pBdr>
+          <w:bottom w:val="single" w:sz="4" w:space="1" w:color="auto"/>
+        </w:pBdr>
+      </w:pPr>
+      <w:r>
+        <w:t>{body}</w:t>
+      </w:r>
+    </w:p>
+    <w:p>
+      <w:pPr>
+        <w:pStyle w:val="ClosureReportText"/>
+      </w:pPr>
+      <w:r>
+        <w:t>{/closures}</w:t>
       </w:r>
     </w:p>
     <w:sectPr>
@@ -786,7 +707,7 @@
 </file>
 
 <file path=word/endnotes.xml><?xml version="1.0" encoding="utf-8"?>
-<w:endnotes xmlns:wpc="http://schemas.microsoft.com/office/word/2010/wordprocessingCanvas" xmlns:cx="http://schemas.microsoft.com/office/drawing/2014/chartex" xmlns:cx1="http://schemas.microsoft.com/office/drawing/2015/9/8/chartex" xmlns:cx2="http://schemas.microsoft.com/office/drawing/2015/10/21/chartex" xmlns:cx3="http://schemas.microsoft.com/office/drawing/2016/5/9/chartex" xmlns:cx4="http://schemas.microsoft.com/office/drawing/2016/5/10/chartex" xmlns:cx5="http://schemas.microsoft.com/office/drawing/2016/5/11/chartex" xmlns:cx6="http://schemas.microsoft.com/office/drawing/2016/5/12/chartex" xmlns:cx7="http://schemas.microsoft.com/office/drawing/2016/5/13/chartex" xmlns:cx8="http://schemas.microsoft.com/office/drawing/2016/5/14/chartex" xmlns:mc="http://schemas.openxmlformats.org/markup-compatibility/2006" xmlns:aink="http://schemas.microsoft.com/office/drawing/2016/ink" xmlns:am3d="http://schemas.microsoft.com/office/drawing/2017/model3d" xmlns:o="urn:schemas-microsoft-com:office:office" xmlns:oel="http://schemas.microsoft.com/office/2019/extlst" xmlns:r="http://schemas.openxmlformats.org/officeDocument/2006/relationships" xmlns:m="http://schemas.openxmlformats.org/officeDocument/2006/math" xmlns:v="urn:schemas-microsoft-com:vml" xmlns:wp14="http://schemas.microsoft.com/office/word/2010/wordprocessingDrawing" xmlns:wp="http://schemas.openxmlformats.org/drawingml/2006/wordprocessingDrawing" xmlns:w10="urn:schemas-microsoft-com:office:word" xmlns:w="http://schemas.openxmlformats.org/wordprocessingml/2006/main" xmlns:w14="http://schemas.microsoft.com/office/word/2010/wordml" xmlns:w15="http://schemas.microsoft.com/office/word/2012/wordml" xmlns:w16cex="http://schemas.microsoft.com/office/word/2018/wordml/cex" xmlns:w16cid="http://schemas.microsoft.com/office/word/2016/wordml/cid" xmlns:w16="http://schemas.microsoft.com/office/word/2018/wordml" xmlns:w16du="http://schemas.microsoft.com/office/word/2023/wordml/word16du" xmlns:w16sdtdh="http://schemas.microsoft.com/office/word/2020/wordml/sdtdatahash" xmlns:w16sdtfl="http://schemas.microsoft.com/office/word/2024/wordml/sdtformatlock" xmlns:w16se="http://schemas.microsoft.com/office/word/2015/wordml/symex" xmlns:wpg="http://schemas.microsoft.com/office/word/2010/wordprocessingGroup" xmlns:wpi="http://schemas.microsoft.com/office/word/2010/wordprocessingInk" xmlns:wne="http://schemas.microsoft.com/office/word/2006/wordml" xmlns:wps="http://schemas.microsoft.com/office/word/2010/wordprocessingShape" mc:Ignorable="w14 w15 w16se w16cid w16 w16cex w16sdtdh w16sdtfl w16du wp14">
+<w:endnotes xmlns:wpc="http://schemas.microsoft.com/office/word/2010/wordprocessingCanvas" xmlns:cx="http://schemas.microsoft.com/office/drawing/2014/chartex" xmlns:cx1="http://schemas.microsoft.com/office/drawing/2015/9/8/chartex" xmlns:cx2="http://schemas.microsoft.com/office/drawing/2015/10/21/chartex" xmlns:cx3="http://schemas.microsoft.com/office/drawing/2016/5/9/chartex" xmlns:cx4="http://schemas.microsoft.com/office/drawing/2016/5/10/chartex" xmlns:cx5="http://schemas.microsoft.com/office/drawing/2016/5/11/chartex" xmlns:cx6="http://schemas.microsoft.com/office/drawing/2016/5/12/chartex" xmlns:cx7="http://schemas.microsoft.com/office/drawing/2016/5/13/chartex" xmlns:cx8="http://schemas.microsoft.com/office/drawing/2016/5/14/chartex" xmlns:mc="http://schemas.openxmlformats.org/markup-compatibility/2006" xmlns:aink="http://schemas.microsoft.com/office/drawing/2016/ink" xmlns:am3d="http://schemas.microsoft.com/office/drawing/2017/model3d" xmlns:o="urn:schemas-microsoft-com:office:office" xmlns:oel="http://schemas.microsoft.com/office/2019/extlst" xmlns:r="http://schemas.openxmlformats.org/officeDocument/2006/relationships" xmlns:m="http://schemas.openxmlformats.org/officeDocument/2006/math" xmlns:v="urn:schemas-microsoft-com:vml" xmlns:wp14="http://schemas.microsoft.com/office/word/2010/wordprocessingDrawing" xmlns:wp="http://schemas.openxmlformats.org/drawingml/2006/wordprocessingDrawing" xmlns:w10="urn:schemas-microsoft-com:office:word" xmlns:w="http://schemas.openxmlformats.org/wordprocessingml/2006/main" xmlns:w14="http://schemas.microsoft.com/office/word/2010/wordml" xmlns:w15="http://schemas.microsoft.com/office/word/2012/wordml" xmlns:w16cei="http://schemas.microsoft.com/office/word/2026/wordml/cei" xmlns:w16cex="http://schemas.microsoft.com/office/word/2018/wordml/cex" xmlns:w16cid="http://schemas.microsoft.com/office/word/2016/wordml/cid" xmlns:w16="http://schemas.microsoft.com/office/word/2018/wordml" xmlns:w16du="http://schemas.microsoft.com/office/word/2023/wordml/word16du" xmlns:w16sdtdh="http://schemas.microsoft.com/office/word/2020/wordml/sdtdatahash" xmlns:w16sdtfl="http://schemas.microsoft.com/office/word/2024/wordml/sdtformatlock" xmlns:w16se="http://schemas.microsoft.com/office/word/2015/wordml/symex" xmlns:wpg="http://schemas.microsoft.com/office/word/2010/wordprocessingGroup" xmlns:wpi="http://schemas.microsoft.com/office/word/2010/wordprocessingInk" xmlns:wne="http://schemas.microsoft.com/office/word/2006/wordml" xmlns:wps="http://schemas.microsoft.com/office/word/2010/wordprocessingShape" mc:Ignorable="w14 w15 w16se w16cid w16 w16cex w16sdtdh w16sdtfl w16du wp14">
   <w:endnote w:type="separator" w:id="-1">
     <w:p>
       <w:pPr>
@@ -811,7 +732,7 @@
 </file>
 
 <file path=word/footer1.xml><?xml version="1.0" encoding="utf-8"?>
-<w:ftr xmlns:wpc="http://schemas.microsoft.com/office/word/2010/wordprocessingCanvas" xmlns:cx="http://schemas.microsoft.com/office/drawing/2014/chartex" xmlns:cx1="http://schemas.microsoft.com/office/drawing/2015/9/8/chartex" xmlns:cx2="http://schemas.microsoft.com/office/drawing/2015/10/21/chartex" xmlns:cx3="http://schemas.microsoft.com/office/drawing/2016/5/9/chartex" xmlns:cx4="http://schemas.microsoft.com/office/drawing/2016/5/10/chartex" xmlns:cx5="http://schemas.microsoft.com/office/drawing/2016/5/11/chartex" xmlns:cx6="http://schemas.microsoft.com/office/drawing/2016/5/12/chartex" xmlns:cx7="http://schemas.microsoft.com/office/drawing/2016/5/13/chartex" xmlns:cx8="http://schemas.microsoft.com/office/drawing/2016/5/14/chartex" xmlns:mc="http://schemas.openxmlformats.org/markup-compatibility/2006" xmlns:aink="http://schemas.microsoft.com/office/drawing/2016/ink" xmlns:am3d="http://schemas.microsoft.com/office/drawing/2017/model3d" xmlns:o="urn:schemas-microsoft-com:office:office" xmlns:oel="http://schemas.microsoft.com/office/2019/extlst" xmlns:r="http://schemas.openxmlformats.org/officeDocument/2006/relationships" xmlns:m="http://schemas.openxmlformats.org/officeDocument/2006/math" xmlns:v="urn:schemas-microsoft-com:vml" xmlns:wp14="http://schemas.microsoft.com/office/word/2010/wordprocessingDrawing" xmlns:wp="http://schemas.openxmlformats.org/drawingml/2006/wordprocessingDrawing" xmlns:w10="urn:schemas-microsoft-com:office:word" xmlns:w="http://schemas.openxmlformats.org/wordprocessingml/2006/main" xmlns:w14="http://schemas.microsoft.com/office/word/2010/wordml" xmlns:w15="http://schemas.microsoft.com/office/word/2012/wordml" xmlns:w16cex="http://schemas.microsoft.com/office/word/2018/wordml/cex" xmlns:w16cid="http://schemas.microsoft.com/office/word/2016/wordml/cid" xmlns:w16="http://schemas.microsoft.com/office/word/2018/wordml" xmlns:w16du="http://schemas.microsoft.com/office/word/2023/wordml/word16du" xmlns:w16sdtdh="http://schemas.microsoft.com/office/word/2020/wordml/sdtdatahash" xmlns:w16sdtfl="http://schemas.microsoft.com/office/word/2024/wordml/sdtformatlock" xmlns:w16se="http://schemas.microsoft.com/office/word/2015/wordml/symex" xmlns:wpg="http://schemas.microsoft.com/office/word/2010/wordprocessingGroup" xmlns:wpi="http://schemas.microsoft.com/office/word/2010/wordprocessingInk" xmlns:wne="http://schemas.microsoft.com/office/word/2006/wordml" xmlns:wps="http://schemas.microsoft.com/office/word/2010/wordprocessingShape" mc:Ignorable="w14 w15 w16se w16cid w16 w16cex w16sdtdh w16sdtfl w16du wp14">
+<w:ftr xmlns:wpc="http://schemas.microsoft.com/office/word/2010/wordprocessingCanvas" xmlns:cx="http://schemas.microsoft.com/office/drawing/2014/chartex" xmlns:cx1="http://schemas.microsoft.com/office/drawing/2015/9/8/chartex" xmlns:cx2="http://schemas.microsoft.com/office/drawing/2015/10/21/chartex" xmlns:cx3="http://schemas.microsoft.com/office/drawing/2016/5/9/chartex" xmlns:cx4="http://schemas.microsoft.com/office/drawing/2016/5/10/chartex" xmlns:cx5="http://schemas.microsoft.com/office/drawing/2016/5/11/chartex" xmlns:cx6="http://schemas.microsoft.com/office/drawing/2016/5/12/chartex" xmlns:cx7="http://schemas.microsoft.com/office/drawing/2016/5/13/chartex" xmlns:cx8="http://schemas.microsoft.com/office/drawing/2016/5/14/chartex" xmlns:mc="http://schemas.openxmlformats.org/markup-compatibility/2006" xmlns:aink="http://schemas.microsoft.com/office/drawing/2016/ink" xmlns:am3d="http://schemas.microsoft.com/office/drawing/2017/model3d" xmlns:o="urn:schemas-microsoft-com:office:office" xmlns:oel="http://schemas.microsoft.com/office/2019/extlst" xmlns:r="http://schemas.openxmlformats.org/officeDocument/2006/relationships" xmlns:m="http://schemas.openxmlformats.org/officeDocument/2006/math" xmlns:v="urn:schemas-microsoft-com:vml" xmlns:wp14="http://schemas.microsoft.com/office/word/2010/wordprocessingDrawing" xmlns:wp="http://schemas.openxmlformats.org/drawingml/2006/wordprocessingDrawing" xmlns:w10="urn:schemas-microsoft-com:office:word" xmlns:w="http://schemas.openxmlformats.org/wordprocessingml/2006/main" xmlns:w14="http://schemas.microsoft.com/office/word/2010/wordml" xmlns:w15="http://schemas.microsoft.com/office/word/2012/wordml" xmlns:w16cei="http://schemas.microsoft.com/office/word/2026/wordml/cei" xmlns:w16cex="http://schemas.microsoft.com/office/word/2018/wordml/cex" xmlns:w16cid="http://schemas.microsoft.com/office/word/2016/wordml/cid" xmlns:w16="http://schemas.microsoft.com/office/word/2018/wordml" xmlns:w16du="http://schemas.microsoft.com/office/word/2023/wordml/word16du" xmlns:w16sdtdh="http://schemas.microsoft.com/office/word/2020/wordml/sdtdatahash" xmlns:w16sdtfl="http://schemas.microsoft.com/office/word/2024/wordml/sdtformatlock" xmlns:w16se="http://schemas.microsoft.com/office/word/2015/wordml/symex" xmlns:wpg="http://schemas.microsoft.com/office/word/2010/wordprocessingGroup" xmlns:wpi="http://schemas.microsoft.com/office/word/2010/wordprocessingInk" xmlns:wne="http://schemas.microsoft.com/office/word/2006/wordml" xmlns:wps="http://schemas.microsoft.com/office/word/2010/wordprocessingShape" mc:Ignorable="w14 w15 w16se w16cid w16 w16cex w16sdtdh w16sdtfl w16du wp14">
   <w:tbl>
     <w:tblPr>
       <w:tblStyle w:val="TableGrid"/>
@@ -844,17 +765,27 @@
           <w:r>
             <w:t>{</w:t>
           </w:r>
+          <w:proofErr w:type="spellStart"/>
           <w:r>
             <w:t>p</w:t>
           </w:r>
           <w:r>
-            <w:t>rojectNumber} {</w:t>
-          </w:r>
+            <w:t>rojectNumber</w:t>
+          </w:r>
+          <w:proofErr w:type="spellEnd"/>
+          <w:r>
+            <w:t>} {</w:t>
+          </w:r>
+          <w:proofErr w:type="spellStart"/>
           <w:r>
             <w:t>p</w:t>
           </w:r>
           <w:r>
-            <w:t>rojectName}</w:t>
+            <w:t>rojectName</w:t>
+          </w:r>
+          <w:proofErr w:type="spellEnd"/>
+          <w:r>
+            <w:t>}</w:t>
           </w:r>
         </w:p>
         <w:p>
@@ -865,11 +796,16 @@
           <w:r>
             <w:t>{</w:t>
           </w:r>
+          <w:proofErr w:type="spellStart"/>
           <w:r>
             <w:t>a</w:t>
           </w:r>
           <w:r>
-            <w:t xml:space="preserve">pplicationNumber} </w:t>
+            <w:t>pplicationNumber</w:t>
+          </w:r>
+          <w:proofErr w:type="spellEnd"/>
+          <w:r>
+            <w:t xml:space="preserve">} </w:t>
           </w:r>
           <w:r>
             <w:t>Submittal</w:t>
@@ -877,17 +813,27 @@
           <w:r>
             <w:t xml:space="preserve"> {</w:t>
           </w:r>
+          <w:proofErr w:type="spellStart"/>
           <w:r>
             <w:t>s</w:t>
           </w:r>
           <w:r>
-            <w:t>ubmittalNumber} ({</w:t>
-          </w:r>
+            <w:t>ubmittalNumber</w:t>
+          </w:r>
+          <w:proofErr w:type="spellEnd"/>
+          <w:r>
+            <w:t>} ({</w:t>
+          </w:r>
+          <w:proofErr w:type="spellStart"/>
           <w:r>
             <w:t>s</w:t>
           </w:r>
           <w:r>
-            <w:t>ubmittalDate})</w:t>
+            <w:t>ubmittalDate</w:t>
+          </w:r>
+          <w:proofErr w:type="spellEnd"/>
+          <w:r>
+            <w:t>})</w:t>
           </w:r>
         </w:p>
       </w:tc>
@@ -903,11 +849,16 @@
           <w:r>
             <w:t>{</w:t>
           </w:r>
+          <w:proofErr w:type="spellStart"/>
           <w:r>
             <w:t>c</w:t>
           </w:r>
           <w:r>
-            <w:t>lientName}</w:t>
+            <w:t>lientName</w:t>
+          </w:r>
+          <w:proofErr w:type="spellEnd"/>
+          <w:r>
+            <w:t>}</w:t>
           </w:r>
         </w:p>
         <w:p>
@@ -1006,7 +957,7 @@
 </file>
 
 <file path=word/footer2.xml><?xml version="1.0" encoding="utf-8"?>
-<w:ftr xmlns:wpc="http://schemas.microsoft.com/office/word/2010/wordprocessingCanvas" xmlns:cx="http://schemas.microsoft.com/office/drawing/2014/chartex" xmlns:cx1="http://schemas.microsoft.com/office/drawing/2015/9/8/chartex" xmlns:cx2="http://schemas.microsoft.com/office/drawing/2015/10/21/chartex" xmlns:cx3="http://schemas.microsoft.com/office/drawing/2016/5/9/chartex" xmlns:cx4="http://schemas.microsoft.com/office/drawing/2016/5/10/chartex" xmlns:cx5="http://schemas.microsoft.com/office/drawing/2016/5/11/chartex" xmlns:cx6="http://schemas.microsoft.com/office/drawing/2016/5/12/chartex" xmlns:cx7="http://schemas.microsoft.com/office/drawing/2016/5/13/chartex" xmlns:cx8="http://schemas.microsoft.com/office/drawing/2016/5/14/chartex" xmlns:mc="http://schemas.openxmlformats.org/markup-compatibility/2006" xmlns:aink="http://schemas.microsoft.com/office/drawing/2016/ink" xmlns:am3d="http://schemas.microsoft.com/office/drawing/2017/model3d" xmlns:o="urn:schemas-microsoft-com:office:office" xmlns:oel="http://schemas.microsoft.com/office/2019/extlst" xmlns:r="http://schemas.openxmlformats.org/officeDocument/2006/relationships" xmlns:m="http://schemas.openxmlformats.org/officeDocument/2006/math" xmlns:v="urn:schemas-microsoft-com:vml" xmlns:wp14="http://schemas.microsoft.com/office/word/2010/wordprocessingDrawing" xmlns:wp="http://schemas.openxmlformats.org/drawingml/2006/wordprocessingDrawing" xmlns:w10="urn:schemas-microsoft-com:office:word" xmlns:w="http://schemas.openxmlformats.org/wordprocessingml/2006/main" xmlns:w14="http://schemas.microsoft.com/office/word/2010/wordml" xmlns:w15="http://schemas.microsoft.com/office/word/2012/wordml" xmlns:w16cex="http://schemas.microsoft.com/office/word/2018/wordml/cex" xmlns:w16cid="http://schemas.microsoft.com/office/word/2016/wordml/cid" xmlns:w16="http://schemas.microsoft.com/office/word/2018/wordml" xmlns:w16du="http://schemas.microsoft.com/office/word/2023/wordml/word16du" xmlns:w16sdtdh="http://schemas.microsoft.com/office/word/2020/wordml/sdtdatahash" xmlns:w16sdtfl="http://schemas.microsoft.com/office/word/2024/wordml/sdtformatlock" xmlns:w16se="http://schemas.microsoft.com/office/word/2015/wordml/symex" xmlns:wpg="http://schemas.microsoft.com/office/word/2010/wordprocessingGroup" xmlns:wpi="http://schemas.microsoft.com/office/word/2010/wordprocessingInk" xmlns:wne="http://schemas.microsoft.com/office/word/2006/wordml" xmlns:wps="http://schemas.microsoft.com/office/word/2010/wordprocessingShape" mc:Ignorable="w14 w15 w16se w16cid w16 w16cex w16sdtdh w16sdtfl w16du wp14">
+<w:ftr xmlns:wpc="http://schemas.microsoft.com/office/word/2010/wordprocessingCanvas" xmlns:cx="http://schemas.microsoft.com/office/drawing/2014/chartex" xmlns:cx1="http://schemas.microsoft.com/office/drawing/2015/9/8/chartex" xmlns:cx2="http://schemas.microsoft.com/office/drawing/2015/10/21/chartex" xmlns:cx3="http://schemas.microsoft.com/office/drawing/2016/5/9/chartex" xmlns:cx4="http://schemas.microsoft.com/office/drawing/2016/5/10/chartex" xmlns:cx5="http://schemas.microsoft.com/office/drawing/2016/5/11/chartex" xmlns:cx6="http://schemas.microsoft.com/office/drawing/2016/5/12/chartex" xmlns:cx7="http://schemas.microsoft.com/office/drawing/2016/5/13/chartex" xmlns:cx8="http://schemas.microsoft.com/office/drawing/2016/5/14/chartex" xmlns:mc="http://schemas.openxmlformats.org/markup-compatibility/2006" xmlns:aink="http://schemas.microsoft.com/office/drawing/2016/ink" xmlns:am3d="http://schemas.microsoft.com/office/drawing/2017/model3d" xmlns:o="urn:schemas-microsoft-com:office:office" xmlns:oel="http://schemas.microsoft.com/office/2019/extlst" xmlns:r="http://schemas.openxmlformats.org/officeDocument/2006/relationships" xmlns:m="http://schemas.openxmlformats.org/officeDocument/2006/math" xmlns:v="urn:schemas-microsoft-com:vml" xmlns:wp14="http://schemas.microsoft.com/office/word/2010/wordprocessingDrawing" xmlns:wp="http://schemas.openxmlformats.org/drawingml/2006/wordprocessingDrawing" xmlns:w10="urn:schemas-microsoft-com:office:word" xmlns:w="http://schemas.openxmlformats.org/wordprocessingml/2006/main" xmlns:w14="http://schemas.microsoft.com/office/word/2010/wordml" xmlns:w15="http://schemas.microsoft.com/office/word/2012/wordml" xmlns:w16cei="http://schemas.microsoft.com/office/word/2026/wordml/cei" xmlns:w16cex="http://schemas.microsoft.com/office/word/2018/wordml/cex" xmlns:w16cid="http://schemas.microsoft.com/office/word/2016/wordml/cid" xmlns:w16="http://schemas.microsoft.com/office/word/2018/wordml" xmlns:w16du="http://schemas.microsoft.com/office/word/2023/wordml/word16du" xmlns:w16sdtdh="http://schemas.microsoft.com/office/word/2020/wordml/sdtdatahash" xmlns:w16sdtfl="http://schemas.microsoft.com/office/word/2024/wordml/sdtformatlock" xmlns:w16se="http://schemas.microsoft.com/office/word/2015/wordml/symex" xmlns:wpg="http://schemas.microsoft.com/office/word/2010/wordprocessingGroup" xmlns:wpi="http://schemas.microsoft.com/office/word/2010/wordprocessingInk" xmlns:wne="http://schemas.microsoft.com/office/word/2006/wordml" xmlns:wps="http://schemas.microsoft.com/office/word/2010/wordprocessingShape" mc:Ignorable="w14 w15 w16se w16cid w16 w16cex w16sdtdh w16sdtfl w16du wp14">
   <w:tbl>
     <w:tblPr>
       <w:tblStyle w:val="TableGrid"/>
@@ -1039,17 +990,27 @@
           <w:r>
             <w:t>{</w:t>
           </w:r>
+          <w:proofErr w:type="spellStart"/>
           <w:r>
             <w:t>p</w:t>
           </w:r>
           <w:r>
-            <w:t>rojectNumber} {</w:t>
-          </w:r>
+            <w:t>rojectNumber</w:t>
+          </w:r>
+          <w:proofErr w:type="spellEnd"/>
+          <w:r>
+            <w:t>} {</w:t>
+          </w:r>
+          <w:proofErr w:type="spellStart"/>
           <w:r>
             <w:t>p</w:t>
           </w:r>
           <w:r>
-            <w:t>rojectName}</w:t>
+            <w:t>rojectName</w:t>
+          </w:r>
+          <w:proofErr w:type="spellEnd"/>
+          <w:r>
+            <w:t>}</w:t>
           </w:r>
         </w:p>
         <w:p>
@@ -1060,23 +1021,38 @@
           <w:r>
             <w:t>{</w:t>
           </w:r>
+          <w:proofErr w:type="spellStart"/>
           <w:r>
             <w:t>a</w:t>
           </w:r>
           <w:r>
-            <w:t>pplicationNumber} Submittal {</w:t>
-          </w:r>
+            <w:t>pplicationNumber</w:t>
+          </w:r>
+          <w:proofErr w:type="spellEnd"/>
+          <w:r>
+            <w:t>} Submittal {</w:t>
+          </w:r>
+          <w:proofErr w:type="spellStart"/>
           <w:r>
             <w:t>s</w:t>
           </w:r>
           <w:r>
-            <w:t>ubmittalNumber} ({</w:t>
-          </w:r>
+            <w:t>ubmittalNumber</w:t>
+          </w:r>
+          <w:proofErr w:type="spellEnd"/>
+          <w:r>
+            <w:t>} ({</w:t>
+          </w:r>
+          <w:proofErr w:type="spellStart"/>
           <w:r>
             <w:t>s</w:t>
           </w:r>
           <w:r>
-            <w:t>ubmittalDate})</w:t>
+            <w:t>ubmittalDate</w:t>
+          </w:r>
+          <w:proofErr w:type="spellEnd"/>
+          <w:r>
+            <w:t>})</w:t>
           </w:r>
         </w:p>
       </w:tc>
@@ -1092,11 +1068,16 @@
           <w:r>
             <w:t>{</w:t>
           </w:r>
+          <w:proofErr w:type="spellStart"/>
           <w:r>
             <w:t>c</w:t>
           </w:r>
           <w:r>
-            <w:t>lientName}</w:t>
+            <w:t>lientName</w:t>
+          </w:r>
+          <w:proofErr w:type="spellEnd"/>
+          <w:r>
+            <w:t>}</w:t>
           </w:r>
         </w:p>
         <w:p>
@@ -1207,7 +1188,7 @@
 </file>
 
 <file path=word/footnotes.xml><?xml version="1.0" encoding="utf-8"?>
-<w:footnotes xmlns:wpc="http://schemas.microsoft.com/office/word/2010/wordprocessingCanvas" xmlns:cx="http://schemas.microsoft.com/office/drawing/2014/chartex" xmlns:cx1="http://schemas.microsoft.com/office/drawing/2015/9/8/chartex" xmlns:cx2="http://schemas.microsoft.com/office/drawing/2015/10/21/chartex" xmlns:cx3="http://schemas.microsoft.com/office/drawing/2016/5/9/chartex" xmlns:cx4="http://schemas.microsoft.com/office/drawing/2016/5/10/chartex" xmlns:cx5="http://schemas.microsoft.com/office/drawing/2016/5/11/chartex" xmlns:cx6="http://schemas.microsoft.com/office/drawing/2016/5/12/chartex" xmlns:cx7="http://schemas.microsoft.com/office/drawing/2016/5/13/chartex" xmlns:cx8="http://schemas.microsoft.com/office/drawing/2016/5/14/chartex" xmlns:mc="http://schemas.openxmlformats.org/markup-compatibility/2006" xmlns:aink="http://schemas.microsoft.com/office/drawing/2016/ink" xmlns:am3d="http://schemas.microsoft.com/office/drawing/2017/model3d" xmlns:o="urn:schemas-microsoft-com:office:office" xmlns:oel="http://schemas.microsoft.com/office/2019/extlst" xmlns:r="http://schemas.openxmlformats.org/officeDocument/2006/relationships" xmlns:m="http://schemas.openxmlformats.org/officeDocument/2006/math" xmlns:v="urn:schemas-microsoft-com:vml" xmlns:wp14="http://schemas.microsoft.com/office/word/2010/wordprocessingDrawing" xmlns:wp="http://schemas.openxmlformats.org/drawingml/2006/wordprocessingDrawing" xmlns:w10="urn:schemas-microsoft-com:office:word" xmlns:w="http://schemas.openxmlformats.org/wordprocessingml/2006/main" xmlns:w14="http://schemas.microsoft.com/office/word/2010/wordml" xmlns:w15="http://schemas.microsoft.com/office/word/2012/wordml" xmlns:w16cex="http://schemas.microsoft.com/office/word/2018/wordml/cex" xmlns:w16cid="http://schemas.microsoft.com/office/word/2016/wordml/cid" xmlns:w16="http://schemas.microsoft.com/office/word/2018/wordml" xmlns:w16du="http://schemas.microsoft.com/office/word/2023/wordml/word16du" xmlns:w16sdtdh="http://schemas.microsoft.com/office/word/2020/wordml/sdtdatahash" xmlns:w16sdtfl="http://schemas.microsoft.com/office/word/2024/wordml/sdtformatlock" xmlns:w16se="http://schemas.microsoft.com/office/word/2015/wordml/symex" xmlns:wpg="http://schemas.microsoft.com/office/word/2010/wordprocessingGroup" xmlns:wpi="http://schemas.microsoft.com/office/word/2010/wordprocessingInk" xmlns:wne="http://schemas.microsoft.com/office/word/2006/wordml" xmlns:wps="http://schemas.microsoft.com/office/word/2010/wordprocessingShape" mc:Ignorable="w14 w15 w16se w16cid w16 w16cex w16sdtdh w16sdtfl w16du wp14">
+<w:footnotes xmlns:wpc="http://schemas.microsoft.com/office/word/2010/wordprocessingCanvas" xmlns:cx="http://schemas.microsoft.com/office/drawing/2014/chartex" xmlns:cx1="http://schemas.microsoft.com/office/drawing/2015/9/8/chartex" xmlns:cx2="http://schemas.microsoft.com/office/drawing/2015/10/21/chartex" xmlns:cx3="http://schemas.microsoft.com/office/drawing/2016/5/9/chartex" xmlns:cx4="http://schemas.microsoft.com/office/drawing/2016/5/10/chartex" xmlns:cx5="http://schemas.microsoft.com/office/drawing/2016/5/11/chartex" xmlns:cx6="http://schemas.microsoft.com/office/drawing/2016/5/12/chartex" xmlns:cx7="http://schemas.microsoft.com/office/drawing/2016/5/13/chartex" xmlns:cx8="http://schemas.microsoft.com/office/drawing/2016/5/14/chartex" xmlns:mc="http://schemas.openxmlformats.org/markup-compatibility/2006" xmlns:aink="http://schemas.microsoft.com/office/drawing/2016/ink" xmlns:am3d="http://schemas.microsoft.com/office/drawing/2017/model3d" xmlns:o="urn:schemas-microsoft-com:office:office" xmlns:oel="http://schemas.microsoft.com/office/2019/extlst" xmlns:r="http://schemas.openxmlformats.org/officeDocument/2006/relationships" xmlns:m="http://schemas.openxmlformats.org/officeDocument/2006/math" xmlns:v="urn:schemas-microsoft-com:vml" xmlns:wp14="http://schemas.microsoft.com/office/word/2010/wordprocessingDrawing" xmlns:wp="http://schemas.openxmlformats.org/drawingml/2006/wordprocessingDrawing" xmlns:w10="urn:schemas-microsoft-com:office:word" xmlns:w="http://schemas.openxmlformats.org/wordprocessingml/2006/main" xmlns:w14="http://schemas.microsoft.com/office/word/2010/wordml" xmlns:w15="http://schemas.microsoft.com/office/word/2012/wordml" xmlns:w16cei="http://schemas.microsoft.com/office/word/2026/wordml/cei" xmlns:w16cex="http://schemas.microsoft.com/office/word/2018/wordml/cex" xmlns:w16cid="http://schemas.microsoft.com/office/word/2016/wordml/cid" xmlns:w16="http://schemas.microsoft.com/office/word/2018/wordml" xmlns:w16du="http://schemas.microsoft.com/office/word/2023/wordml/word16du" xmlns:w16sdtdh="http://schemas.microsoft.com/office/word/2020/wordml/sdtdatahash" xmlns:w16sdtfl="http://schemas.microsoft.com/office/word/2024/wordml/sdtformatlock" xmlns:w16se="http://schemas.microsoft.com/office/word/2015/wordml/symex" xmlns:wpg="http://schemas.microsoft.com/office/word/2010/wordprocessingGroup" xmlns:wpi="http://schemas.microsoft.com/office/word/2010/wordprocessingInk" xmlns:wne="http://schemas.microsoft.com/office/word/2006/wordml" xmlns:wps="http://schemas.microsoft.com/office/word/2010/wordprocessingShape" mc:Ignorable="w14 w15 w16se w16cid w16 w16cex w16sdtdh w16sdtfl w16du wp14">
   <w:footnote w:type="separator" w:id="-1">
     <w:p>
       <w:pPr>
@@ -2294,8 +2275,9 @@
     <w:basedOn w:val="ClosureReportText"/>
     <w:link w:val="ClosureReportHeaderChar"/>
     <w:qFormat/>
-    <w:rsid w:val="00E614AC"/>
+    <w:rsid w:val="00FE12AE"/>
     <w:pPr>
+      <w:spacing w:before="120"/>
       <w:jc w:val="center"/>
     </w:pPr>
     <w:rPr>
@@ -2306,7 +2288,7 @@
     <w:name w:val="Closure Report Header Char"/>
     <w:basedOn w:val="ClosureReportTextChar"/>
     <w:link w:val="ClosureReportHeader"/>
-    <w:rsid w:val="00E614AC"/>
+    <w:rsid w:val="00FE12AE"/>
     <w:rPr>
       <w:rFonts w:ascii="Courier New" w:hAnsi="Courier New"/>
       <w:b/>
@@ -2655,11 +2637,15 @@
 </file>
 
 <file path=customXml/item1.xml><?xml version="1.0" encoding="utf-8"?>
+<b:Sources xmlns:b="http://schemas.openxmlformats.org/officeDocument/2006/bibliography" xmlns="http://schemas.openxmlformats.org/officeDocument/2006/bibliography" SelectedStyle="\APASixthEditionOfficeOnline.xsl" StyleName="APA" Version="6"/>
+</file>
+
+<file path=customXml/item2.xml><?xml version="1.0" encoding="utf-8"?>
 <LotClosure>
 </LotClosure>
 </file>
 
-<file path=customXml/item2.xml><?xml version="1.0" encoding="utf-8"?>
+<file path=customXml/item3.xml><?xml version="1.0" encoding="utf-8"?>
 <LotClosure>
   <ClientName/>
   <ClientStreetAddress/>
@@ -2672,26 +2658,22 @@
 </LotClosure>
 </file>
 
-<file path=customXml/item3.xml><?xml version="1.0" encoding="utf-8"?>
-<b:Sources xmlns:b="http://schemas.openxmlformats.org/officeDocument/2006/bibliography" xmlns="http://schemas.openxmlformats.org/officeDocument/2006/bibliography" SelectedStyle="\APASixthEditionOfficeOnline.xsl" StyleName="APA" Version="6"/>
+<file path=customXml/itemProps1.xml><?xml version="1.0" encoding="utf-8"?>
+<ds:datastoreItem xmlns:ds="http://schemas.openxmlformats.org/officeDocument/2006/customXml" ds:itemID="{5738218A-D651-49C2-AE9F-0E7E45B33EDA}">
+  <ds:schemaRefs>
+    <ds:schemaRef ds:uri="http://schemas.openxmlformats.org/officeDocument/2006/bibliography"/>
+  </ds:schemaRefs>
+</ds:datastoreItem>
 </file>
 
-<file path=customXml/itemProps1.xml><?xml version="1.0" encoding="utf-8"?>
+<file path=customXml/itemProps2.xml><?xml version="1.0" encoding="utf-8"?>
 <ds:datastoreItem xmlns:ds="http://schemas.openxmlformats.org/officeDocument/2006/customXml" ds:itemID="{C9DDF8E2-AB4E-4616-9C13-EE8D225EE398}">
   <ds:schemaRefs/>
 </ds:datastoreItem>
 </file>
 
-<file path=customXml/itemProps2.xml><?xml version="1.0" encoding="utf-8"?>
+<file path=customXml/itemProps3.xml><?xml version="1.0" encoding="utf-8"?>
 <ds:datastoreItem xmlns:ds="http://schemas.openxmlformats.org/officeDocument/2006/customXml" ds:itemID="{6A2FE373-227A-476F-AB44-CB35A434D6D3}">
   <ds:schemaRefs/>
 </ds:datastoreItem>
-</file>
-
-<file path=customXml/itemProps3.xml><?xml version="1.0" encoding="utf-8"?>
-<ds:datastoreItem xmlns:ds="http://schemas.openxmlformats.org/officeDocument/2006/customXml" ds:itemID="{5738218A-D651-49C2-AE9F-0E7E45B33EDA}">
-  <ds:schemaRefs>
-    <ds:schemaRef ds:uri="http://schemas.openxmlformats.org/officeDocument/2006/bibliography"/>
-  </ds:schemaRefs>
-</ds:datastoreItem>
 </file>
</xml_diff>